<commit_message>
nuevos cambios para mid level datafusion
</commit_message>
<xml_diff>
--- a/Utils/Índice general propuesto.docx
+++ b/Utils/Índice general propuesto.docx
@@ -1,6 +1,6 @@
 
 <file path=word/document.xml><?xml version="1.0" encoding="utf-8"?>
-<w:document xmlns:wpc="http://schemas.microsoft.com/office/word/2010/wordprocessingCanvas" xmlns:cx="http://schemas.microsoft.com/office/drawing/2014/chartex" xmlns:cx1="http://schemas.microsoft.com/office/drawing/2015/9/8/chartex" xmlns:cx2="http://schemas.microsoft.com/office/drawing/2015/10/21/chartex" xmlns:cx3="http://schemas.microsoft.com/office/drawing/2016/5/9/chartex" xmlns:cx4="http://schemas.microsoft.com/office/drawing/2016/5/10/chartex" xmlns:cx5="http://schemas.microsoft.com/office/drawing/2016/5/11/chartex" xmlns:cx6="http://schemas.microsoft.com/office/drawing/2016/5/12/chartex" xmlns:cx7="http://schemas.microsoft.com/office/drawing/2016/5/13/chartex" xmlns:cx8="http://schemas.microsoft.com/office/drawing/2016/5/14/chartex" xmlns:mc="http://schemas.openxmlformats.org/markup-compatibility/2006" xmlns:aink="http://schemas.microsoft.com/office/drawing/2016/ink" xmlns:am3d="http://schemas.microsoft.com/office/drawing/2017/model3d" xmlns:o="urn:schemas-microsoft-com:office:office" xmlns:oel="http://schemas.microsoft.com/office/2019/extlst" xmlns:r="http://schemas.openxmlformats.org/officeDocument/2006/relationships" xmlns:m="http://schemas.openxmlformats.org/officeDocument/2006/math" xmlns:v="urn:schemas-microsoft-com:vml" xmlns:wp14="http://schemas.microsoft.com/office/word/2010/wordprocessingDrawing" xmlns:wp="http://schemas.openxmlformats.org/drawingml/2006/wordprocessingDrawing" xmlns:w10="urn:schemas-microsoft-com:office:word" xmlns:w="http://schemas.openxmlformats.org/wordprocessingml/2006/main" xmlns:w14="http://schemas.microsoft.com/office/word/2010/wordml" xmlns:w15="http://schemas.microsoft.com/office/word/2012/wordml" xmlns:w16cex="http://schemas.microsoft.com/office/word/2018/wordml/cex" xmlns:w16cid="http://schemas.microsoft.com/office/word/2016/wordml/cid" xmlns:w16="http://schemas.microsoft.com/office/word/2018/wordml" xmlns:w16sdtdh="http://schemas.microsoft.com/office/word/2020/wordml/sdtdatahash" xmlns:w16se="http://schemas.microsoft.com/office/word/2015/wordml/symex" xmlns:wpg="http://schemas.microsoft.com/office/word/2010/wordprocessingGroup" xmlns:wpi="http://schemas.microsoft.com/office/word/2010/wordprocessingInk" xmlns:wne="http://schemas.microsoft.com/office/word/2006/wordml" xmlns:wps="http://schemas.microsoft.com/office/word/2010/wordprocessingShape" mc:Ignorable="w14 w15 w16se w16cid w16 w16cex w16sdtdh wp14">
+<w:document xmlns:wpc="http://schemas.microsoft.com/office/word/2010/wordprocessingCanvas" xmlns:cx="http://schemas.microsoft.com/office/drawing/2014/chartex" xmlns:cx1="http://schemas.microsoft.com/office/drawing/2015/9/8/chartex" xmlns:cx2="http://schemas.microsoft.com/office/drawing/2015/10/21/chartex" xmlns:cx3="http://schemas.microsoft.com/office/drawing/2016/5/9/chartex" xmlns:cx4="http://schemas.microsoft.com/office/drawing/2016/5/10/chartex" xmlns:cx5="http://schemas.microsoft.com/office/drawing/2016/5/11/chartex" xmlns:cx6="http://schemas.microsoft.com/office/drawing/2016/5/12/chartex" xmlns:cx7="http://schemas.microsoft.com/office/drawing/2016/5/13/chartex" xmlns:cx8="http://schemas.microsoft.com/office/drawing/2016/5/14/chartex" xmlns:mc="http://schemas.openxmlformats.org/markup-compatibility/2006" xmlns:aink="http://schemas.microsoft.com/office/drawing/2016/ink" xmlns:am3d="http://schemas.microsoft.com/office/drawing/2017/model3d" xmlns:o="urn:schemas-microsoft-com:office:office" xmlns:oel="http://schemas.microsoft.com/office/2019/extlst" xmlns:r="http://schemas.openxmlformats.org/officeDocument/2006/relationships" xmlns:m="http://schemas.openxmlformats.org/officeDocument/2006/math" xmlns:v="urn:schemas-microsoft-com:vml" xmlns:wp14="http://schemas.microsoft.com/office/word/2010/wordprocessingDrawing" xmlns:wp="http://schemas.openxmlformats.org/drawingml/2006/wordprocessingDrawing" xmlns:w10="urn:schemas-microsoft-com:office:word" xmlns:w="http://schemas.openxmlformats.org/wordprocessingml/2006/main" xmlns:w14="http://schemas.microsoft.com/office/word/2010/wordml" xmlns:w15="http://schemas.microsoft.com/office/word/2012/wordml" xmlns:w16cex="http://schemas.microsoft.com/office/word/2018/wordml/cex" xmlns:w16cid="http://schemas.microsoft.com/office/word/2016/wordml/cid" xmlns:w16="http://schemas.microsoft.com/office/word/2018/wordml" xmlns:w16du="http://schemas.microsoft.com/office/word/2023/wordml/word16du" xmlns:w16sdtdh="http://schemas.microsoft.com/office/word/2020/wordml/sdtdatahash" xmlns:w16se="http://schemas.microsoft.com/office/word/2015/wordml/symex" xmlns:wpg="http://schemas.microsoft.com/office/word/2010/wordprocessingGroup" xmlns:wpi="http://schemas.microsoft.com/office/word/2010/wordprocessingInk" xmlns:wne="http://schemas.microsoft.com/office/word/2006/wordml" xmlns:wps="http://schemas.microsoft.com/office/word/2010/wordprocessingShape" mc:Ignorable="w14 w15 w16se w16cid w16 w16cex w16sdtdh w16du wp14">
   <w:body>
     <w:p>
       <w:pPr>
@@ -497,21 +497,8 @@
           <w:lang w:eastAsia="es-MX"/>
           <w14:ligatures w14:val="none"/>
         </w:rPr>
-        <w:t xml:space="preserve">2.6. Análisis multivariante y </w:t>
-      </w:r>
-      <w:proofErr w:type="spellStart"/>
-      <w:r>
-        <w:rPr>
-          <w:rFonts w:ascii="Times New Roman" w:eastAsia="Times New Roman" w:hAnsi="Times New Roman" w:cs="Times New Roman"/>
-          <w:kern w:val="0"/>
-          <w:sz w:val="24"/>
-          <w:szCs w:val="24"/>
-          <w:lang w:eastAsia="es-MX"/>
-          <w14:ligatures w14:val="none"/>
-        </w:rPr>
-        <w:t>quimiometría</w:t>
-      </w:r>
-      <w:proofErr w:type="spellEnd"/>
+        <w:t>2.6. Análisis multivariante y quimiometría</w:t>
+      </w:r>
       <w:r>
         <w:rPr>
           <w:rFonts w:ascii="Times New Roman" w:eastAsia="Times New Roman" w:hAnsi="Times New Roman" w:cs="Times New Roman"/>
@@ -570,116 +557,31 @@
           <w:lang w:eastAsia="es-MX"/>
           <w14:ligatures w14:val="none"/>
         </w:rPr>
-        <w:t xml:space="preserve">2.7. Fusión de datos (Data </w:t>
-      </w:r>
-      <w:proofErr w:type="spellStart"/>
-      <w:r>
-        <w:rPr>
-          <w:rFonts w:ascii="Times New Roman" w:eastAsia="Times New Roman" w:hAnsi="Times New Roman" w:cs="Times New Roman"/>
-          <w:kern w:val="0"/>
-          <w:sz w:val="24"/>
-          <w:szCs w:val="24"/>
-          <w:lang w:eastAsia="es-MX"/>
-          <w14:ligatures w14:val="none"/>
-        </w:rPr>
-        <w:t>Fusion</w:t>
-      </w:r>
-      <w:proofErr w:type="spellEnd"/>
-      <w:r>
-        <w:rPr>
-          <w:rFonts w:ascii="Times New Roman" w:eastAsia="Times New Roman" w:hAnsi="Times New Roman" w:cs="Times New Roman"/>
-          <w:kern w:val="0"/>
-          <w:sz w:val="24"/>
-          <w:szCs w:val="24"/>
-          <w:lang w:eastAsia="es-MX"/>
-          <w14:ligatures w14:val="none"/>
-        </w:rPr>
-        <w:t>)</w:t>
-      </w:r>
-      <w:r>
-        <w:rPr>
-          <w:rFonts w:ascii="Times New Roman" w:eastAsia="Times New Roman" w:hAnsi="Times New Roman" w:cs="Times New Roman"/>
-          <w:kern w:val="0"/>
-          <w:sz w:val="24"/>
-          <w:szCs w:val="24"/>
-          <w:lang w:eastAsia="es-MX"/>
-          <w14:ligatures w14:val="none"/>
-        </w:rPr>
-        <w:br/>
-        <w:t xml:space="preserve">  2.7.1. Conceptos generales de data </w:t>
-      </w:r>
-      <w:proofErr w:type="spellStart"/>
-      <w:r>
-        <w:rPr>
-          <w:rFonts w:ascii="Times New Roman" w:eastAsia="Times New Roman" w:hAnsi="Times New Roman" w:cs="Times New Roman"/>
-          <w:kern w:val="0"/>
-          <w:sz w:val="24"/>
-          <w:szCs w:val="24"/>
-          <w:lang w:eastAsia="es-MX"/>
-          <w14:ligatures w14:val="none"/>
-        </w:rPr>
-        <w:t>fusion</w:t>
-      </w:r>
-      <w:proofErr w:type="spellEnd"/>
-      <w:r>
-        <w:rPr>
-          <w:rFonts w:ascii="Times New Roman" w:eastAsia="Times New Roman" w:hAnsi="Times New Roman" w:cs="Times New Roman"/>
-          <w:kern w:val="0"/>
-          <w:sz w:val="24"/>
-          <w:szCs w:val="24"/>
-          <w:lang w:eastAsia="es-MX"/>
-          <w14:ligatures w14:val="none"/>
-        </w:rPr>
-        <w:br/>
-        <w:t>  2.7.2. Fusión de bajo nivel (Low-</w:t>
-      </w:r>
-      <w:proofErr w:type="spellStart"/>
-      <w:r>
-        <w:rPr>
-          <w:rFonts w:ascii="Times New Roman" w:eastAsia="Times New Roman" w:hAnsi="Times New Roman" w:cs="Times New Roman"/>
-          <w:kern w:val="0"/>
-          <w:sz w:val="24"/>
-          <w:szCs w:val="24"/>
-          <w:lang w:eastAsia="es-MX"/>
-          <w14:ligatures w14:val="none"/>
-        </w:rPr>
-        <w:t>Level</w:t>
-      </w:r>
-      <w:proofErr w:type="spellEnd"/>
-      <w:r>
-        <w:rPr>
-          <w:rFonts w:ascii="Times New Roman" w:eastAsia="Times New Roman" w:hAnsi="Times New Roman" w:cs="Times New Roman"/>
-          <w:kern w:val="0"/>
-          <w:sz w:val="24"/>
-          <w:szCs w:val="24"/>
-          <w:lang w:eastAsia="es-MX"/>
-          <w14:ligatures w14:val="none"/>
-        </w:rPr>
-        <w:t xml:space="preserve"> Data </w:t>
-      </w:r>
-      <w:proofErr w:type="spellStart"/>
-      <w:r>
-        <w:rPr>
-          <w:rFonts w:ascii="Times New Roman" w:eastAsia="Times New Roman" w:hAnsi="Times New Roman" w:cs="Times New Roman"/>
-          <w:kern w:val="0"/>
-          <w:sz w:val="24"/>
-          <w:szCs w:val="24"/>
-          <w:lang w:eastAsia="es-MX"/>
-          <w14:ligatures w14:val="none"/>
-        </w:rPr>
-        <w:t>Fusion</w:t>
-      </w:r>
-      <w:proofErr w:type="spellEnd"/>
-      <w:r>
-        <w:rPr>
-          <w:rFonts w:ascii="Times New Roman" w:eastAsia="Times New Roman" w:hAnsi="Times New Roman" w:cs="Times New Roman"/>
-          <w:kern w:val="0"/>
-          <w:sz w:val="24"/>
-          <w:szCs w:val="24"/>
-          <w:lang w:eastAsia="es-MX"/>
-          <w14:ligatures w14:val="none"/>
-        </w:rPr>
-        <w:t>)</w:t>
+        <w:t>2.7. Fusión de datos (Data Fusion)</w:t>
+      </w:r>
+      <w:r>
+        <w:rPr>
+          <w:rFonts w:ascii="Times New Roman" w:eastAsia="Times New Roman" w:hAnsi="Times New Roman" w:cs="Times New Roman"/>
+          <w:kern w:val="0"/>
+          <w:sz w:val="24"/>
+          <w:szCs w:val="24"/>
+          <w:lang w:eastAsia="es-MX"/>
+          <w14:ligatures w14:val="none"/>
+        </w:rPr>
+        <w:br/>
+        <w:t>  2.7.1. Conceptos generales de data fusion</w:t>
+      </w:r>
+      <w:r>
+        <w:rPr>
+          <w:rFonts w:ascii="Times New Roman" w:eastAsia="Times New Roman" w:hAnsi="Times New Roman" w:cs="Times New Roman"/>
+          <w:kern w:val="0"/>
+          <w:sz w:val="24"/>
+          <w:szCs w:val="24"/>
+          <w:lang w:eastAsia="es-MX"/>
+          <w14:ligatures w14:val="none"/>
+        </w:rPr>
+        <w:br/>
+        <w:t>  2.7.2. Fusión de bajo nivel (Low-Level Data Fusion)</w:t>
       </w:r>
       <w:r>
         <w:rPr>
@@ -783,31 +685,7 @@
           <w14:ligatures w14:val="none"/>
         </w:rPr>
         <w:br/>
-        <w:t xml:space="preserve">3.2. Aplicaciones de data </w:t>
-      </w:r>
-      <w:proofErr w:type="spellStart"/>
-      <w:r>
-        <w:rPr>
-          <w:rFonts w:ascii="Times New Roman" w:eastAsia="Times New Roman" w:hAnsi="Times New Roman" w:cs="Times New Roman"/>
-          <w:kern w:val="0"/>
-          <w:sz w:val="24"/>
-          <w:szCs w:val="24"/>
-          <w:lang w:eastAsia="es-MX"/>
-          <w14:ligatures w14:val="none"/>
-        </w:rPr>
-        <w:t>fusion</w:t>
-      </w:r>
-      <w:proofErr w:type="spellEnd"/>
-      <w:r>
-        <w:rPr>
-          <w:rFonts w:ascii="Times New Roman" w:eastAsia="Times New Roman" w:hAnsi="Times New Roman" w:cs="Times New Roman"/>
-          <w:kern w:val="0"/>
-          <w:sz w:val="24"/>
-          <w:szCs w:val="24"/>
-          <w:lang w:eastAsia="es-MX"/>
-          <w14:ligatures w14:val="none"/>
-        </w:rPr>
-        <w:t xml:space="preserve"> en espectroscopía</w:t>
+        <w:t>3.2. Aplicaciones de data fusion en espectroscopía</w:t>
       </w:r>
       <w:r>
         <w:rPr>
@@ -936,21 +814,8 @@
           <w:lang w:eastAsia="es-MX"/>
           <w14:ligatures w14:val="none"/>
         </w:rPr>
-        <w:t xml:space="preserve">4.1. Descripción de las muestras y </w:t>
-      </w:r>
-      <w:proofErr w:type="spellStart"/>
-      <w:r>
-        <w:rPr>
-          <w:rFonts w:ascii="Times New Roman" w:eastAsia="Times New Roman" w:hAnsi="Times New Roman" w:cs="Times New Roman"/>
-          <w:kern w:val="0"/>
-          <w:sz w:val="24"/>
-          <w:szCs w:val="24"/>
-          <w:lang w:eastAsia="es-MX"/>
-          <w14:ligatures w14:val="none"/>
-        </w:rPr>
-        <w:t>datasets</w:t>
-      </w:r>
-      <w:proofErr w:type="spellEnd"/>
+        <w:t>4.1. Descripción de las muestras y datasets</w:t>
+      </w:r>
       <w:r>
         <w:rPr>
           <w:rFonts w:ascii="Times New Roman" w:eastAsia="Times New Roman" w:hAnsi="Times New Roman" w:cs="Times New Roman"/>
@@ -1081,79 +946,7 @@
           <w14:ligatures w14:val="none"/>
         </w:rPr>
         <w:br/>
-        <w:t xml:space="preserve">  4.3.1. Lenguaje de programación y librerías (Python, </w:t>
-      </w:r>
-      <w:proofErr w:type="spellStart"/>
-      <w:r>
-        <w:rPr>
-          <w:rFonts w:ascii="Times New Roman" w:eastAsia="Times New Roman" w:hAnsi="Times New Roman" w:cs="Times New Roman"/>
-          <w:kern w:val="0"/>
-          <w:sz w:val="24"/>
-          <w:szCs w:val="24"/>
-          <w:lang w:eastAsia="es-MX"/>
-          <w14:ligatures w14:val="none"/>
-        </w:rPr>
-        <w:t>NumPy</w:t>
-      </w:r>
-      <w:proofErr w:type="spellEnd"/>
-      <w:r>
-        <w:rPr>
-          <w:rFonts w:ascii="Times New Roman" w:eastAsia="Times New Roman" w:hAnsi="Times New Roman" w:cs="Times New Roman"/>
-          <w:kern w:val="0"/>
-          <w:sz w:val="24"/>
-          <w:szCs w:val="24"/>
-          <w:lang w:eastAsia="es-MX"/>
-          <w14:ligatures w14:val="none"/>
-        </w:rPr>
-        <w:t xml:space="preserve">, </w:t>
-      </w:r>
-      <w:proofErr w:type="spellStart"/>
-      <w:r>
-        <w:rPr>
-          <w:rFonts w:ascii="Times New Roman" w:eastAsia="Times New Roman" w:hAnsi="Times New Roman" w:cs="Times New Roman"/>
-          <w:kern w:val="0"/>
-          <w:sz w:val="24"/>
-          <w:szCs w:val="24"/>
-          <w:lang w:eastAsia="es-MX"/>
-          <w14:ligatures w14:val="none"/>
-        </w:rPr>
-        <w:t>SciPy</w:t>
-      </w:r>
-      <w:proofErr w:type="spellEnd"/>
-      <w:r>
-        <w:rPr>
-          <w:rFonts w:ascii="Times New Roman" w:eastAsia="Times New Roman" w:hAnsi="Times New Roman" w:cs="Times New Roman"/>
-          <w:kern w:val="0"/>
-          <w:sz w:val="24"/>
-          <w:szCs w:val="24"/>
-          <w:lang w:eastAsia="es-MX"/>
-          <w14:ligatures w14:val="none"/>
-        </w:rPr>
-        <w:t xml:space="preserve">, </w:t>
-      </w:r>
-      <w:proofErr w:type="spellStart"/>
-      <w:r>
-        <w:rPr>
-          <w:rFonts w:ascii="Times New Roman" w:eastAsia="Times New Roman" w:hAnsi="Times New Roman" w:cs="Times New Roman"/>
-          <w:kern w:val="0"/>
-          <w:sz w:val="24"/>
-          <w:szCs w:val="24"/>
-          <w:lang w:eastAsia="es-MX"/>
-          <w14:ligatures w14:val="none"/>
-        </w:rPr>
-        <w:t>scikit-learn</w:t>
-      </w:r>
-      <w:proofErr w:type="spellEnd"/>
-      <w:r>
-        <w:rPr>
-          <w:rFonts w:ascii="Times New Roman" w:eastAsia="Times New Roman" w:hAnsi="Times New Roman" w:cs="Times New Roman"/>
-          <w:kern w:val="0"/>
-          <w:sz w:val="24"/>
-          <w:szCs w:val="24"/>
-          <w:lang w:eastAsia="es-MX"/>
-          <w14:ligatures w14:val="none"/>
-        </w:rPr>
-        <w:t>…)</w:t>
+        <w:t>  4.3.1. Lenguaje de programación y librerías (Python, NumPy, SciPy, scikit-learn…)</w:t>
       </w:r>
       <w:r>
         <w:rPr>
@@ -1297,55 +1090,7 @@
           <w14:ligatures w14:val="none"/>
         </w:rPr>
         <w:br/>
-        <w:t>  4.5.3. Estrategia de validación (</w:t>
-      </w:r>
-      <w:proofErr w:type="spellStart"/>
-      <w:r>
-        <w:rPr>
-          <w:rFonts w:ascii="Times New Roman" w:eastAsia="Times New Roman" w:hAnsi="Times New Roman" w:cs="Times New Roman"/>
-          <w:kern w:val="0"/>
-          <w:sz w:val="24"/>
-          <w:szCs w:val="24"/>
-          <w:lang w:eastAsia="es-MX"/>
-          <w14:ligatures w14:val="none"/>
-        </w:rPr>
-        <w:t>train</w:t>
-      </w:r>
-      <w:proofErr w:type="spellEnd"/>
-      <w:r>
-        <w:rPr>
-          <w:rFonts w:ascii="Times New Roman" w:eastAsia="Times New Roman" w:hAnsi="Times New Roman" w:cs="Times New Roman"/>
-          <w:kern w:val="0"/>
-          <w:sz w:val="24"/>
-          <w:szCs w:val="24"/>
-          <w:lang w:eastAsia="es-MX"/>
-          <w14:ligatures w14:val="none"/>
-        </w:rPr>
-        <w:t xml:space="preserve">/test, </w:t>
-      </w:r>
-      <w:proofErr w:type="spellStart"/>
-      <w:r>
-        <w:rPr>
-          <w:rFonts w:ascii="Times New Roman" w:eastAsia="Times New Roman" w:hAnsi="Times New Roman" w:cs="Times New Roman"/>
-          <w:kern w:val="0"/>
-          <w:sz w:val="24"/>
-          <w:szCs w:val="24"/>
-          <w:lang w:eastAsia="es-MX"/>
-          <w14:ligatures w14:val="none"/>
-        </w:rPr>
-        <w:t>cross-validation</w:t>
-      </w:r>
-      <w:proofErr w:type="spellEnd"/>
-      <w:r>
-        <w:rPr>
-          <w:rFonts w:ascii="Times New Roman" w:eastAsia="Times New Roman" w:hAnsi="Times New Roman" w:cs="Times New Roman"/>
-          <w:kern w:val="0"/>
-          <w:sz w:val="24"/>
-          <w:szCs w:val="24"/>
-          <w:lang w:eastAsia="es-MX"/>
-          <w14:ligatures w14:val="none"/>
-        </w:rPr>
-        <w:t>, etc.)</w:t>
+        <w:t>  4.5.3. Estrategia de validación (train/test, cross-validation, etc.)</w:t>
       </w:r>
     </w:p>
     <w:p>
@@ -1400,35 +1145,7 @@
           <w:lang w:eastAsia="es-MX"/>
           <w14:ligatures w14:val="none"/>
         </w:rPr>
-        <w:t xml:space="preserve">Capítulo 5. Diseño e implementación de </w:t>
-      </w:r>
-      <w:proofErr w:type="spellStart"/>
-      <w:r>
-        <w:rPr>
-          <w:rFonts w:ascii="Times New Roman" w:eastAsia="Times New Roman" w:hAnsi="Times New Roman" w:cs="Times New Roman"/>
-          <w:b/>
-          <w:bCs/>
-          <w:kern w:val="0"/>
-          <w:sz w:val="27"/>
-          <w:szCs w:val="27"/>
-          <w:lang w:eastAsia="es-MX"/>
-          <w14:ligatures w14:val="none"/>
-        </w:rPr>
-        <w:t>EspectroApp</w:t>
-      </w:r>
-      <w:proofErr w:type="spellEnd"/>
-      <w:r>
-        <w:rPr>
-          <w:rFonts w:ascii="Times New Roman" w:eastAsia="Times New Roman" w:hAnsi="Times New Roman" w:cs="Times New Roman"/>
-          <w:b/>
-          <w:bCs/>
-          <w:kern w:val="0"/>
-          <w:sz w:val="27"/>
-          <w:szCs w:val="27"/>
-          <w:lang w:eastAsia="es-MX"/>
-          <w14:ligatures w14:val="none"/>
-        </w:rPr>
-        <w:t xml:space="preserve"> </w:t>
+        <w:t xml:space="preserve">Capítulo 5. Diseño e implementación de EspectroApp </w:t>
       </w:r>
       <w:r>
         <w:rPr>
@@ -1813,21 +1530,8 @@
           <w14:ligatures w14:val="none"/>
         </w:rPr>
         <w:br/>
-        <w:t xml:space="preserve">  6.3.2. Análisis crítico de la mejora (o no) al aplicar data </w:t>
-      </w:r>
-      <w:proofErr w:type="spellStart"/>
-      <w:r>
-        <w:rPr>
-          <w:rFonts w:ascii="Times New Roman" w:eastAsia="Times New Roman" w:hAnsi="Times New Roman" w:cs="Times New Roman"/>
-          <w:kern w:val="0"/>
-          <w:sz w:val="24"/>
-          <w:szCs w:val="24"/>
-          <w:lang w:eastAsia="es-MX"/>
-          <w14:ligatures w14:val="none"/>
-        </w:rPr>
-        <w:t>fusion</w:t>
-      </w:r>
-      <w:proofErr w:type="spellEnd"/>
+        <w:t>  6.3.2. Análisis crítico de la mejora (o no) al aplicar data fusion</w:t>
+      </w:r>
       <w:r>
         <w:rPr>
           <w:rFonts w:ascii="Times New Roman" w:eastAsia="Times New Roman" w:hAnsi="Times New Roman" w:cs="Times New Roman"/>
@@ -2034,63 +1738,7 @@
           <w:lang w:eastAsia="es-MX"/>
           <w14:ligatures w14:val="none"/>
         </w:rPr>
-        <w:t xml:space="preserve">(Gestionadas con </w:t>
-      </w:r>
-      <w:proofErr w:type="spellStart"/>
-      <w:r>
-        <w:rPr>
-          <w:rFonts w:ascii="Times New Roman" w:eastAsia="Times New Roman" w:hAnsi="Times New Roman" w:cs="Times New Roman"/>
-          <w:i/>
-          <w:iCs/>
-          <w:kern w:val="0"/>
-          <w:sz w:val="24"/>
-          <w:szCs w:val="24"/>
-          <w:lang w:eastAsia="es-MX"/>
-          <w14:ligatures w14:val="none"/>
-        </w:rPr>
-        <w:t>BibLaTeX</w:t>
-      </w:r>
-      <w:proofErr w:type="spellEnd"/>
-      <w:r>
-        <w:rPr>
-          <w:rFonts w:ascii="Times New Roman" w:eastAsia="Times New Roman" w:hAnsi="Times New Roman" w:cs="Times New Roman"/>
-          <w:i/>
-          <w:iCs/>
-          <w:kern w:val="0"/>
-          <w:sz w:val="24"/>
-          <w:szCs w:val="24"/>
-          <w:lang w:eastAsia="es-MX"/>
-          <w14:ligatures w14:val="none"/>
-        </w:rPr>
-        <w:t>/</w:t>
-      </w:r>
-      <w:proofErr w:type="spellStart"/>
-      <w:r>
-        <w:rPr>
-          <w:rFonts w:ascii="Times New Roman" w:eastAsia="Times New Roman" w:hAnsi="Times New Roman" w:cs="Times New Roman"/>
-          <w:i/>
-          <w:iCs/>
-          <w:kern w:val="0"/>
-          <w:sz w:val="24"/>
-          <w:szCs w:val="24"/>
-          <w:lang w:eastAsia="es-MX"/>
-          <w14:ligatures w14:val="none"/>
-        </w:rPr>
-        <w:t>Biber</w:t>
-      </w:r>
-      <w:proofErr w:type="spellEnd"/>
-      <w:r>
-        <w:rPr>
-          <w:rFonts w:ascii="Times New Roman" w:eastAsia="Times New Roman" w:hAnsi="Times New Roman" w:cs="Times New Roman"/>
-          <w:i/>
-          <w:iCs/>
-          <w:kern w:val="0"/>
-          <w:sz w:val="24"/>
-          <w:szCs w:val="24"/>
-          <w:lang w:eastAsia="es-MX"/>
-          <w14:ligatures w14:val="none"/>
-        </w:rPr>
-        <w:t xml:space="preserve"> como ya estás usando.)</w:t>
+        <w:t>(Gestionadas con BibLaTeX/Biber como ya estás usando.)</w:t>
       </w:r>
     </w:p>
     <w:p>
@@ -2206,21 +1854,8 @@
           <w14:ligatures w14:val="none"/>
         </w:rPr>
         <w:br/>
-        <w:t xml:space="preserve">D. Interfaces adicionales de </w:t>
-      </w:r>
-      <w:proofErr w:type="spellStart"/>
-      <w:r>
-        <w:rPr>
-          <w:rFonts w:ascii="Times New Roman" w:eastAsia="Times New Roman" w:hAnsi="Times New Roman" w:cs="Times New Roman"/>
-          <w:kern w:val="0"/>
-          <w:sz w:val="24"/>
-          <w:szCs w:val="24"/>
-          <w:lang w:eastAsia="es-MX"/>
-          <w14:ligatures w14:val="none"/>
-        </w:rPr>
-        <w:t>EspectroApp</w:t>
-      </w:r>
-      <w:proofErr w:type="spellEnd"/>
+        <w:t>D. Interfaces adicionales de EspectroApp</w:t>
+      </w:r>
     </w:p>
     <w:p>
       <w:pPr>
@@ -2384,9 +2019,19 @@
           <w:lang w:eastAsia="es-MX"/>
           <w14:ligatures w14:val="none"/>
         </w:rPr>
-        <w:t>\</w:t>
-      </w:r>
-      <w:proofErr w:type="spellStart"/>
+        <w:t>\chapter</w:t>
+      </w:r>
+      <w:r>
+        <w:rPr>
+          <w:rFonts w:ascii="Times New Roman" w:eastAsia="Times New Roman" w:hAnsi="Times New Roman" w:cs="Times New Roman"/>
+          <w:kern w:val="0"/>
+          <w:sz w:val="24"/>
+          <w:szCs w:val="24"/>
+          <w:lang w:eastAsia="es-MX"/>
+          <w14:ligatures w14:val="none"/>
+        </w:rPr>
+        <w:t xml:space="preserve">, </w:t>
+      </w:r>
       <w:r>
         <w:rPr>
           <w:rFonts w:ascii="Courier New" w:eastAsia="Times New Roman" w:hAnsi="Courier New" w:cs="Courier New"/>
@@ -2396,19 +2041,18 @@
           <w:lang w:eastAsia="es-MX"/>
           <w14:ligatures w14:val="none"/>
         </w:rPr>
-        <w:t>chapter</w:t>
-      </w:r>
-      <w:proofErr w:type="spellEnd"/>
-      <w:r>
-        <w:rPr>
-          <w:rFonts w:ascii="Times New Roman" w:eastAsia="Times New Roman" w:hAnsi="Times New Roman" w:cs="Times New Roman"/>
-          <w:kern w:val="0"/>
-          <w:sz w:val="24"/>
-          <w:szCs w:val="24"/>
-          <w:lang w:eastAsia="es-MX"/>
-          <w14:ligatures w14:val="none"/>
-        </w:rPr>
-        <w:t xml:space="preserve">, </w:t>
+        <w:t>\section</w:t>
+      </w:r>
+      <w:r>
+        <w:rPr>
+          <w:rFonts w:ascii="Times New Roman" w:eastAsia="Times New Roman" w:hAnsi="Times New Roman" w:cs="Times New Roman"/>
+          <w:kern w:val="0"/>
+          <w:sz w:val="24"/>
+          <w:szCs w:val="24"/>
+          <w:lang w:eastAsia="es-MX"/>
+          <w14:ligatures w14:val="none"/>
+        </w:rPr>
+        <w:t xml:space="preserve"> y </w:t>
       </w:r>
       <w:r>
         <w:rPr>
@@ -2419,56 +2063,8 @@
           <w:lang w:eastAsia="es-MX"/>
           <w14:ligatures w14:val="none"/>
         </w:rPr>
-        <w:t>\</w:t>
-      </w:r>
-      <w:proofErr w:type="spellStart"/>
-      <w:r>
-        <w:rPr>
-          <w:rFonts w:ascii="Courier New" w:eastAsia="Times New Roman" w:hAnsi="Courier New" w:cs="Courier New"/>
-          <w:kern w:val="0"/>
-          <w:sz w:val="20"/>
-          <w:szCs w:val="20"/>
-          <w:lang w:eastAsia="es-MX"/>
-          <w14:ligatures w14:val="none"/>
-        </w:rPr>
-        <w:t>section</w:t>
-      </w:r>
-      <w:proofErr w:type="spellEnd"/>
-      <w:r>
-        <w:rPr>
-          <w:rFonts w:ascii="Times New Roman" w:eastAsia="Times New Roman" w:hAnsi="Times New Roman" w:cs="Times New Roman"/>
-          <w:kern w:val="0"/>
-          <w:sz w:val="24"/>
-          <w:szCs w:val="24"/>
-          <w:lang w:eastAsia="es-MX"/>
-          <w14:ligatures w14:val="none"/>
-        </w:rPr>
-        <w:t xml:space="preserve"> y </w:t>
-      </w:r>
-      <w:r>
-        <w:rPr>
-          <w:rFonts w:ascii="Courier New" w:eastAsia="Times New Roman" w:hAnsi="Courier New" w:cs="Courier New"/>
-          <w:kern w:val="0"/>
-          <w:sz w:val="20"/>
-          <w:szCs w:val="20"/>
-          <w:lang w:eastAsia="es-MX"/>
-          <w14:ligatures w14:val="none"/>
-        </w:rPr>
-        <w:t>\</w:t>
-      </w:r>
-      <w:proofErr w:type="spellStart"/>
-      <w:r>
-        <w:rPr>
-          <w:rFonts w:ascii="Courier New" w:eastAsia="Times New Roman" w:hAnsi="Courier New" w:cs="Courier New"/>
-          <w:kern w:val="0"/>
-          <w:sz w:val="20"/>
-          <w:szCs w:val="20"/>
-          <w:lang w:eastAsia="es-MX"/>
-          <w14:ligatures w14:val="none"/>
-        </w:rPr>
-        <w:t>subsection</w:t>
-      </w:r>
-      <w:proofErr w:type="spellEnd"/>
+        <w:t>\subsection</w:t>
+      </w:r>
       <w:r>
         <w:rPr>
           <w:rFonts w:ascii="Times New Roman" w:eastAsia="Times New Roman" w:hAnsi="Times New Roman" w:cs="Times New Roman"/>
@@ -2479,6 +2075,1983 @@
           <w14:ligatures w14:val="none"/>
         </w:rPr>
         <w:t xml:space="preserve"> listo para pegar en tu .tex.</w:t>
+      </w:r>
+    </w:p>
+    <w:p>
+      <w:pPr>
+        <w:rPr>
+          <w:u w:val="single"/>
+        </w:rPr>
+      </w:pPr>
+    </w:p>
+    <w:p>
+      <w:pPr>
+        <w:rPr>
+          <w:u w:val="single"/>
+        </w:rPr>
+      </w:pPr>
+    </w:p>
+    <w:p>
+      <w:pPr>
+        <w:rPr>
+          <w:u w:val="single"/>
+        </w:rPr>
+      </w:pPr>
+      <w:r>
+        <w:rPr>
+          <w:u w:val="single"/>
+        </w:rPr>
+        <w:t>Hablar sobre PCA</w:t>
+      </w:r>
+    </w:p>
+    <w:p>
+      <w:pPr>
+        <w:numPr>
+          <w:ilvl w:val="0"/>
+          <w:numId w:val="2"/>
+        </w:numPr>
+        <w:pBdr>
+          <w:top w:val="single" w:sz="2" w:space="0" w:color="auto"/>
+          <w:left w:val="single" w:sz="2" w:space="0" w:color="auto"/>
+          <w:bottom w:val="single" w:sz="2" w:space="0" w:color="auto"/>
+          <w:right w:val="single" w:sz="2" w:space="0" w:color="auto"/>
+        </w:pBdr>
+        <w:spacing w:before="100" w:beforeAutospacing="1" w:after="100" w:afterAutospacing="1" w:line="240" w:lineRule="auto"/>
+        <w:rPr>
+          <w:rFonts w:ascii="Segoe UI" w:eastAsia="Times New Roman" w:hAnsi="Segoe UI" w:cs="Segoe UI"/>
+          <w:spacing w:val="2"/>
+          <w:kern w:val="0"/>
+          <w:sz w:val="24"/>
+          <w:szCs w:val="24"/>
+          <w:lang w:eastAsia="es-MX"/>
+          <w14:ligatures w14:val="none"/>
+        </w:rPr>
+      </w:pPr>
+      <w:r>
+        <w:rPr>
+          <w:rFonts w:ascii="Segoe UI" w:eastAsia="Times New Roman" w:hAnsi="Segoe UI" w:cs="Segoe UI"/>
+          <w:b/>
+          <w:bCs/>
+          <w:spacing w:val="2"/>
+          <w:kern w:val="0"/>
+          <w:sz w:val="24"/>
+          <w:szCs w:val="24"/>
+          <w:bdr w:val="single" w:sz="2" w:space="0" w:color="auto" w:frame="1"/>
+          <w:lang w:eastAsia="es-MX"/>
+          <w14:ligatures w14:val="none"/>
+        </w:rPr>
+        <w:t>Qué decir:</w:t>
+      </w:r>
+    </w:p>
+    <w:p>
+      <w:pPr>
+        <w:numPr>
+          <w:ilvl w:val="1"/>
+          <w:numId w:val="2"/>
+        </w:numPr>
+        <w:pBdr>
+          <w:top w:val="single" w:sz="2" w:space="0" w:color="auto"/>
+          <w:left w:val="single" w:sz="2" w:space="0" w:color="auto"/>
+          <w:bottom w:val="single" w:sz="2" w:space="0" w:color="auto"/>
+          <w:right w:val="single" w:sz="2" w:space="0" w:color="auto"/>
+        </w:pBdr>
+        <w:spacing w:before="100" w:beforeAutospacing="1" w:after="100" w:afterAutospacing="1" w:line="240" w:lineRule="auto"/>
+        <w:rPr>
+          <w:rFonts w:ascii="Segoe UI" w:eastAsia="Times New Roman" w:hAnsi="Segoe UI" w:cs="Segoe UI"/>
+          <w:spacing w:val="2"/>
+          <w:kern w:val="0"/>
+          <w:sz w:val="24"/>
+          <w:szCs w:val="24"/>
+          <w:lang w:eastAsia="es-MX"/>
+          <w14:ligatures w14:val="none"/>
+        </w:rPr>
+      </w:pPr>
+      <w:r>
+        <w:rPr>
+          <w:rFonts w:ascii="Segoe UI" w:eastAsia="Times New Roman" w:hAnsi="Segoe UI" w:cs="Segoe UI"/>
+          <w:spacing w:val="2"/>
+          <w:kern w:val="0"/>
+          <w:sz w:val="24"/>
+          <w:szCs w:val="24"/>
+          <w:lang w:eastAsia="es-MX"/>
+          <w14:ligatures w14:val="none"/>
+        </w:rPr>
+        <w:t>Explica que un espectro (Raman o FTIR) no es un solo dato, sino miles (por ejemplo, si mides de 400 a 4000 cm⁻¹, tienes miles de puntos de intensidad).</w:t>
+      </w:r>
+    </w:p>
+    <w:p>
+      <w:pPr>
+        <w:numPr>
+          <w:ilvl w:val="1"/>
+          <w:numId w:val="2"/>
+        </w:numPr>
+        <w:pBdr>
+          <w:top w:val="single" w:sz="2" w:space="0" w:color="auto"/>
+          <w:left w:val="single" w:sz="2" w:space="0" w:color="auto"/>
+          <w:bottom w:val="single" w:sz="2" w:space="0" w:color="auto"/>
+          <w:right w:val="single" w:sz="2" w:space="0" w:color="auto"/>
+        </w:pBdr>
+        <w:spacing w:before="100" w:beforeAutospacing="1" w:after="100" w:afterAutospacing="1" w:line="240" w:lineRule="auto"/>
+        <w:rPr>
+          <w:rFonts w:ascii="Segoe UI" w:eastAsia="Times New Roman" w:hAnsi="Segoe UI" w:cs="Segoe UI"/>
+          <w:spacing w:val="2"/>
+          <w:kern w:val="0"/>
+          <w:sz w:val="24"/>
+          <w:szCs w:val="24"/>
+          <w:lang w:eastAsia="es-MX"/>
+          <w14:ligatures w14:val="none"/>
+        </w:rPr>
+      </w:pPr>
+      <w:r>
+        <w:rPr>
+          <w:rFonts w:ascii="Segoe UI" w:eastAsia="Times New Roman" w:hAnsi="Segoe UI" w:cs="Segoe UI"/>
+          <w:spacing w:val="2"/>
+          <w:kern w:val="0"/>
+          <w:sz w:val="24"/>
+          <w:szCs w:val="24"/>
+          <w:lang w:eastAsia="es-MX"/>
+          <w14:ligatures w14:val="none"/>
+        </w:rPr>
+        <w:t>Cada número de onda (wavenumber) actúa como una "variable".</w:t>
+      </w:r>
+    </w:p>
+    <w:p>
+      <w:pPr>
+        <w:numPr>
+          <w:ilvl w:val="1"/>
+          <w:numId w:val="2"/>
+        </w:numPr>
+        <w:pBdr>
+          <w:top w:val="single" w:sz="2" w:space="0" w:color="auto"/>
+          <w:left w:val="single" w:sz="2" w:space="0" w:color="auto"/>
+          <w:bottom w:val="single" w:sz="2" w:space="0" w:color="auto"/>
+          <w:right w:val="single" w:sz="2" w:space="0" w:color="auto"/>
+        </w:pBdr>
+        <w:spacing w:before="100" w:beforeAutospacing="1" w:after="100" w:afterAutospacing="1" w:line="240" w:lineRule="auto"/>
+        <w:rPr>
+          <w:rFonts w:ascii="Segoe UI" w:eastAsia="Times New Roman" w:hAnsi="Segoe UI" w:cs="Segoe UI"/>
+          <w:spacing w:val="2"/>
+          <w:kern w:val="0"/>
+          <w:sz w:val="24"/>
+          <w:szCs w:val="24"/>
+          <w:lang w:eastAsia="es-MX"/>
+          <w14:ligatures w14:val="none"/>
+        </w:rPr>
+      </w:pPr>
+      <w:r>
+        <w:rPr>
+          <w:rFonts w:ascii="Segoe UI" w:eastAsia="Times New Roman" w:hAnsi="Segoe UI" w:cs="Segoe UI"/>
+          <w:spacing w:val="2"/>
+          <w:kern w:val="0"/>
+          <w:sz w:val="24"/>
+          <w:szCs w:val="24"/>
+          <w:lang w:eastAsia="es-MX"/>
+          <w14:ligatures w14:val="none"/>
+        </w:rPr>
+        <w:t>Analizar "a ojo" diferencias sutiles entre cientos de espectros es imposible y subjetivo.</w:t>
+      </w:r>
+    </w:p>
+    <w:p>
+      <w:pPr>
+        <w:numPr>
+          <w:ilvl w:val="1"/>
+          <w:numId w:val="2"/>
+        </w:numPr>
+        <w:pBdr>
+          <w:top w:val="single" w:sz="2" w:space="0" w:color="auto"/>
+          <w:left w:val="single" w:sz="2" w:space="0" w:color="auto"/>
+          <w:bottom w:val="single" w:sz="2" w:space="0" w:color="auto"/>
+          <w:right w:val="single" w:sz="2" w:space="0" w:color="auto"/>
+        </w:pBdr>
+        <w:spacing w:before="100" w:beforeAutospacing="1" w:after="100" w:afterAutospacing="1" w:line="240" w:lineRule="auto"/>
+        <w:rPr>
+          <w:rFonts w:ascii="Segoe UI" w:eastAsia="Times New Roman" w:hAnsi="Segoe UI" w:cs="Segoe UI"/>
+          <w:spacing w:val="2"/>
+          <w:kern w:val="0"/>
+          <w:sz w:val="24"/>
+          <w:szCs w:val="24"/>
+          <w:lang w:eastAsia="es-MX"/>
+          <w14:ligatures w14:val="none"/>
+        </w:rPr>
+      </w:pPr>
+      <w:r>
+        <w:rPr>
+          <w:rFonts w:ascii="Segoe UI" w:eastAsia="Times New Roman" w:hAnsi="Segoe UI" w:cs="Segoe UI"/>
+          <w:b/>
+          <w:bCs/>
+          <w:spacing w:val="2"/>
+          <w:kern w:val="0"/>
+          <w:sz w:val="24"/>
+          <w:szCs w:val="24"/>
+          <w:bdr w:val="single" w:sz="2" w:space="0" w:color="auto" w:frame="1"/>
+          <w:lang w:eastAsia="es-MX"/>
+          <w14:ligatures w14:val="none"/>
+        </w:rPr>
+        <w:t>Frase clave:</w:t>
+      </w:r>
+      <w:r>
+        <w:rPr>
+          <w:rFonts w:ascii="Segoe UI" w:eastAsia="Times New Roman" w:hAnsi="Segoe UI" w:cs="Segoe UI"/>
+          <w:spacing w:val="2"/>
+          <w:kern w:val="0"/>
+          <w:sz w:val="24"/>
+          <w:szCs w:val="24"/>
+          <w:lang w:eastAsia="es-MX"/>
+          <w14:ligatures w14:val="none"/>
+        </w:rPr>
+        <w:t> "La naturaleza multivariante de los datos espectrales requiere métodos de reducción de dimensionalidad."</w:t>
+      </w:r>
+    </w:p>
+    <w:p>
+      <w:pPr>
+        <w:pBdr>
+          <w:top w:val="single" w:sz="2" w:space="0" w:color="auto"/>
+          <w:left w:val="single" w:sz="2" w:space="0" w:color="auto"/>
+          <w:bottom w:val="single" w:sz="2" w:space="0" w:color="auto"/>
+          <w:right w:val="single" w:sz="2" w:space="0" w:color="auto"/>
+        </w:pBdr>
+        <w:spacing w:before="100" w:beforeAutospacing="1" w:after="100" w:afterAutospacing="1" w:line="240" w:lineRule="auto"/>
+        <w:outlineLvl w:val="1"/>
+        <w:rPr>
+          <w:rFonts w:ascii="Segoe UI" w:eastAsia="Times New Roman" w:hAnsi="Segoe UI" w:cs="Segoe UI"/>
+          <w:b/>
+          <w:bCs/>
+          <w:spacing w:val="2"/>
+          <w:kern w:val="0"/>
+          <w:sz w:val="36"/>
+          <w:szCs w:val="36"/>
+          <w:lang w:eastAsia="es-MX"/>
+          <w14:ligatures w14:val="none"/>
+        </w:rPr>
+      </w:pPr>
+      <w:r>
+        <w:rPr>
+          <w:rFonts w:ascii="Segoe UI" w:eastAsia="Times New Roman" w:hAnsi="Segoe UI" w:cs="Segoe UI"/>
+          <w:b/>
+          <w:bCs/>
+          <w:spacing w:val="2"/>
+          <w:kern w:val="0"/>
+          <w:sz w:val="36"/>
+          <w:szCs w:val="36"/>
+          <w:lang w:eastAsia="es-MX"/>
+          <w14:ligatures w14:val="none"/>
+        </w:rPr>
+        <w:t>2. Pre-procesamiento de Datos (Crucial en Raman/FTIR)</w:t>
+      </w:r>
+    </w:p>
+    <w:p>
+      <w:pPr>
+        <w:pBdr>
+          <w:top w:val="single" w:sz="2" w:space="0" w:color="auto"/>
+          <w:left w:val="single" w:sz="2" w:space="0" w:color="auto"/>
+          <w:bottom w:val="single" w:sz="2" w:space="0" w:color="auto"/>
+          <w:right w:val="single" w:sz="2" w:space="0" w:color="auto"/>
+        </w:pBdr>
+        <w:spacing w:before="100" w:beforeAutospacing="1" w:after="100" w:afterAutospacing="1" w:line="240" w:lineRule="auto"/>
+        <w:rPr>
+          <w:rFonts w:ascii="Segoe UI" w:eastAsia="Times New Roman" w:hAnsi="Segoe UI" w:cs="Segoe UI"/>
+          <w:spacing w:val="2"/>
+          <w:kern w:val="0"/>
+          <w:sz w:val="24"/>
+          <w:szCs w:val="24"/>
+          <w:lang w:eastAsia="es-MX"/>
+          <w14:ligatures w14:val="none"/>
+        </w:rPr>
+      </w:pPr>
+      <w:r>
+        <w:rPr>
+          <w:rFonts w:ascii="Segoe UI" w:eastAsia="Times New Roman" w:hAnsi="Segoe UI" w:cs="Segoe UI"/>
+          <w:spacing w:val="2"/>
+          <w:kern w:val="0"/>
+          <w:sz w:val="24"/>
+          <w:szCs w:val="24"/>
+          <w:lang w:eastAsia="es-MX"/>
+          <w14:ligatures w14:val="none"/>
+        </w:rPr>
+        <w:t>PCA es muy sensible al "ruido". Si no limpias la señal, el PCA analizará el ruido en lugar de la química.</w:t>
+      </w:r>
+    </w:p>
+    <w:p>
+      <w:pPr>
+        <w:numPr>
+          <w:ilvl w:val="0"/>
+          <w:numId w:val="3"/>
+        </w:numPr>
+        <w:pBdr>
+          <w:top w:val="single" w:sz="2" w:space="0" w:color="auto"/>
+          <w:left w:val="single" w:sz="2" w:space="0" w:color="auto"/>
+          <w:bottom w:val="single" w:sz="2" w:space="0" w:color="auto"/>
+          <w:right w:val="single" w:sz="2" w:space="0" w:color="auto"/>
+        </w:pBdr>
+        <w:spacing w:before="100" w:beforeAutospacing="1" w:after="100" w:afterAutospacing="1" w:line="240" w:lineRule="auto"/>
+        <w:rPr>
+          <w:rFonts w:ascii="Segoe UI" w:eastAsia="Times New Roman" w:hAnsi="Segoe UI" w:cs="Segoe UI"/>
+          <w:spacing w:val="2"/>
+          <w:kern w:val="0"/>
+          <w:sz w:val="24"/>
+          <w:szCs w:val="24"/>
+          <w:lang w:eastAsia="es-MX"/>
+          <w14:ligatures w14:val="none"/>
+        </w:rPr>
+      </w:pPr>
+      <w:r>
+        <w:rPr>
+          <w:rFonts w:ascii="Segoe UI" w:eastAsia="Times New Roman" w:hAnsi="Segoe UI" w:cs="Segoe UI"/>
+          <w:b/>
+          <w:bCs/>
+          <w:spacing w:val="2"/>
+          <w:kern w:val="0"/>
+          <w:sz w:val="24"/>
+          <w:szCs w:val="24"/>
+          <w:bdr w:val="single" w:sz="2" w:space="0" w:color="auto" w:frame="1"/>
+          <w:lang w:eastAsia="es-MX"/>
+          <w14:ligatures w14:val="none"/>
+        </w:rPr>
+        <w:t>Qué decir:</w:t>
+      </w:r>
+    </w:p>
+    <w:p>
+      <w:pPr>
+        <w:numPr>
+          <w:ilvl w:val="1"/>
+          <w:numId w:val="3"/>
+        </w:numPr>
+        <w:pBdr>
+          <w:top w:val="single" w:sz="2" w:space="0" w:color="auto"/>
+          <w:left w:val="single" w:sz="2" w:space="0" w:color="auto"/>
+          <w:bottom w:val="single" w:sz="2" w:space="0" w:color="auto"/>
+          <w:right w:val="single" w:sz="2" w:space="0" w:color="auto"/>
+        </w:pBdr>
+        <w:spacing w:before="100" w:beforeAutospacing="1" w:after="100" w:afterAutospacing="1" w:line="240" w:lineRule="auto"/>
+        <w:rPr>
+          <w:rFonts w:ascii="Segoe UI" w:eastAsia="Times New Roman" w:hAnsi="Segoe UI" w:cs="Segoe UI"/>
+          <w:spacing w:val="2"/>
+          <w:kern w:val="0"/>
+          <w:sz w:val="24"/>
+          <w:szCs w:val="24"/>
+          <w:lang w:eastAsia="es-MX"/>
+          <w14:ligatures w14:val="none"/>
+        </w:rPr>
+      </w:pPr>
+      <w:r>
+        <w:rPr>
+          <w:rFonts w:ascii="Segoe UI" w:eastAsia="Times New Roman" w:hAnsi="Segoe UI" w:cs="Segoe UI"/>
+          <w:spacing w:val="2"/>
+          <w:kern w:val="0"/>
+          <w:sz w:val="24"/>
+          <w:szCs w:val="24"/>
+          <w:lang w:eastAsia="es-MX"/>
+          <w14:ligatures w14:val="none"/>
+        </w:rPr>
+        <w:t>Menciona que los datos crudos (raw data) casi nunca se usan directamente.</w:t>
+      </w:r>
+    </w:p>
+    <w:p>
+      <w:pPr>
+        <w:numPr>
+          <w:ilvl w:val="1"/>
+          <w:numId w:val="3"/>
+        </w:numPr>
+        <w:pBdr>
+          <w:top w:val="single" w:sz="2" w:space="0" w:color="auto"/>
+          <w:left w:val="single" w:sz="2" w:space="0" w:color="auto"/>
+          <w:bottom w:val="single" w:sz="2" w:space="0" w:color="auto"/>
+          <w:right w:val="single" w:sz="2" w:space="0" w:color="auto"/>
+        </w:pBdr>
+        <w:spacing w:before="100" w:beforeAutospacing="1" w:after="100" w:afterAutospacing="1" w:line="240" w:lineRule="auto"/>
+        <w:rPr>
+          <w:rFonts w:ascii="Segoe UI" w:eastAsia="Times New Roman" w:hAnsi="Segoe UI" w:cs="Segoe UI"/>
+          <w:spacing w:val="2"/>
+          <w:kern w:val="0"/>
+          <w:sz w:val="24"/>
+          <w:szCs w:val="24"/>
+          <w:lang w:eastAsia="es-MX"/>
+          <w14:ligatures w14:val="none"/>
+        </w:rPr>
+      </w:pPr>
+      <w:r>
+        <w:rPr>
+          <w:rFonts w:ascii="Segoe UI" w:eastAsia="Times New Roman" w:hAnsi="Segoe UI" w:cs="Segoe UI"/>
+          <w:b/>
+          <w:bCs/>
+          <w:spacing w:val="2"/>
+          <w:kern w:val="0"/>
+          <w:sz w:val="24"/>
+          <w:szCs w:val="24"/>
+          <w:bdr w:val="single" w:sz="2" w:space="0" w:color="auto" w:frame="1"/>
+          <w:lang w:eastAsia="es-MX"/>
+          <w14:ligatures w14:val="none"/>
+        </w:rPr>
+        <w:lastRenderedPageBreak/>
+        <w:t>Línea base (Baseline correction):</w:t>
+      </w:r>
+      <w:r>
+        <w:rPr>
+          <w:rFonts w:ascii="Segoe UI" w:eastAsia="Times New Roman" w:hAnsi="Segoe UI" w:cs="Segoe UI"/>
+          <w:spacing w:val="2"/>
+          <w:kern w:val="0"/>
+          <w:sz w:val="24"/>
+          <w:szCs w:val="24"/>
+          <w:lang w:eastAsia="es-MX"/>
+          <w14:ligatures w14:val="none"/>
+        </w:rPr>
+        <w:t> Especialmente en Raman (para quitar fluorescencia).</w:t>
+      </w:r>
+    </w:p>
+    <w:p>
+      <w:pPr>
+        <w:numPr>
+          <w:ilvl w:val="1"/>
+          <w:numId w:val="3"/>
+        </w:numPr>
+        <w:pBdr>
+          <w:top w:val="single" w:sz="2" w:space="0" w:color="auto"/>
+          <w:left w:val="single" w:sz="2" w:space="0" w:color="auto"/>
+          <w:bottom w:val="single" w:sz="2" w:space="0" w:color="auto"/>
+          <w:right w:val="single" w:sz="2" w:space="0" w:color="auto"/>
+        </w:pBdr>
+        <w:spacing w:before="100" w:beforeAutospacing="1" w:after="100" w:afterAutospacing="1" w:line="240" w:lineRule="auto"/>
+        <w:rPr>
+          <w:rFonts w:ascii="Segoe UI" w:eastAsia="Times New Roman" w:hAnsi="Segoe UI" w:cs="Segoe UI"/>
+          <w:spacing w:val="2"/>
+          <w:kern w:val="0"/>
+          <w:sz w:val="24"/>
+          <w:szCs w:val="24"/>
+          <w:lang w:eastAsia="es-MX"/>
+          <w14:ligatures w14:val="none"/>
+        </w:rPr>
+      </w:pPr>
+      <w:r>
+        <w:rPr>
+          <w:rFonts w:ascii="Segoe UI" w:eastAsia="Times New Roman" w:hAnsi="Segoe UI" w:cs="Segoe UI"/>
+          <w:b/>
+          <w:bCs/>
+          <w:spacing w:val="2"/>
+          <w:kern w:val="0"/>
+          <w:sz w:val="24"/>
+          <w:szCs w:val="24"/>
+          <w:bdr w:val="single" w:sz="2" w:space="0" w:color="auto" w:frame="1"/>
+          <w:lang w:eastAsia="es-MX"/>
+          <w14:ligatures w14:val="none"/>
+        </w:rPr>
+        <w:t>Suavizado (Smoothing):</w:t>
+      </w:r>
+      <w:r>
+        <w:rPr>
+          <w:rFonts w:ascii="Segoe UI" w:eastAsia="Times New Roman" w:hAnsi="Segoe UI" w:cs="Segoe UI"/>
+          <w:spacing w:val="2"/>
+          <w:kern w:val="0"/>
+          <w:sz w:val="24"/>
+          <w:szCs w:val="24"/>
+          <w:lang w:eastAsia="es-MX"/>
+          <w14:ligatures w14:val="none"/>
+        </w:rPr>
+        <w:t> Como Savitzky-Golay, para reducir ruido aleatorio.</w:t>
+      </w:r>
+    </w:p>
+    <w:p>
+      <w:pPr>
+        <w:numPr>
+          <w:ilvl w:val="1"/>
+          <w:numId w:val="3"/>
+        </w:numPr>
+        <w:pBdr>
+          <w:top w:val="single" w:sz="2" w:space="0" w:color="auto"/>
+          <w:left w:val="single" w:sz="2" w:space="0" w:color="auto"/>
+          <w:bottom w:val="single" w:sz="2" w:space="0" w:color="auto"/>
+          <w:right w:val="single" w:sz="2" w:space="0" w:color="auto"/>
+        </w:pBdr>
+        <w:spacing w:before="100" w:beforeAutospacing="1" w:after="100" w:afterAutospacing="1" w:line="240" w:lineRule="auto"/>
+        <w:rPr>
+          <w:rFonts w:ascii="Segoe UI" w:eastAsia="Times New Roman" w:hAnsi="Segoe UI" w:cs="Segoe UI"/>
+          <w:spacing w:val="2"/>
+          <w:kern w:val="0"/>
+          <w:sz w:val="24"/>
+          <w:szCs w:val="24"/>
+          <w:lang w:eastAsia="es-MX"/>
+          <w14:ligatures w14:val="none"/>
+        </w:rPr>
+      </w:pPr>
+      <w:r>
+        <w:rPr>
+          <w:rFonts w:ascii="Segoe UI" w:eastAsia="Times New Roman" w:hAnsi="Segoe UI" w:cs="Segoe UI"/>
+          <w:b/>
+          <w:bCs/>
+          <w:spacing w:val="2"/>
+          <w:kern w:val="0"/>
+          <w:sz w:val="24"/>
+          <w:szCs w:val="24"/>
+          <w:bdr w:val="single" w:sz="2" w:space="0" w:color="auto" w:frame="1"/>
+          <w:lang w:eastAsia="es-MX"/>
+          <w14:ligatures w14:val="none"/>
+        </w:rPr>
+        <w:t>Normalización:</w:t>
+      </w:r>
+      <w:r>
+        <w:rPr>
+          <w:rFonts w:ascii="Segoe UI" w:eastAsia="Times New Roman" w:hAnsi="Segoe UI" w:cs="Segoe UI"/>
+          <w:spacing w:val="2"/>
+          <w:kern w:val="0"/>
+          <w:sz w:val="24"/>
+          <w:szCs w:val="24"/>
+          <w:lang w:eastAsia="es-MX"/>
+          <w14:ligatures w14:val="none"/>
+        </w:rPr>
+        <w:t> Para que las diferencias en intensidad no sean por la potencia del láser o la cantidad de muestra, sino por la composición química.</w:t>
+      </w:r>
+    </w:p>
+    <w:p>
+      <w:pPr>
+        <w:pBdr>
+          <w:top w:val="single" w:sz="2" w:space="0" w:color="auto"/>
+          <w:left w:val="single" w:sz="2" w:space="0" w:color="auto"/>
+          <w:bottom w:val="single" w:sz="2" w:space="0" w:color="auto"/>
+          <w:right w:val="single" w:sz="2" w:space="0" w:color="auto"/>
+        </w:pBdr>
+        <w:spacing w:before="100" w:beforeAutospacing="1" w:after="100" w:afterAutospacing="1" w:line="240" w:lineRule="auto"/>
+        <w:outlineLvl w:val="1"/>
+        <w:rPr>
+          <w:rFonts w:ascii="Segoe UI" w:eastAsia="Times New Roman" w:hAnsi="Segoe UI" w:cs="Segoe UI"/>
+          <w:b/>
+          <w:bCs/>
+          <w:spacing w:val="2"/>
+          <w:kern w:val="0"/>
+          <w:sz w:val="36"/>
+          <w:szCs w:val="36"/>
+          <w:lang w:eastAsia="es-MX"/>
+          <w14:ligatures w14:val="none"/>
+        </w:rPr>
+      </w:pPr>
+      <w:r>
+        <w:rPr>
+          <w:rFonts w:ascii="Segoe UI" w:eastAsia="Times New Roman" w:hAnsi="Segoe UI" w:cs="Segoe UI"/>
+          <w:b/>
+          <w:bCs/>
+          <w:spacing w:val="2"/>
+          <w:kern w:val="0"/>
+          <w:sz w:val="36"/>
+          <w:szCs w:val="36"/>
+          <w:lang w:eastAsia="es-MX"/>
+          <w14:ligatures w14:val="none"/>
+        </w:rPr>
+        <w:t>3. Qué es PCA (Conceptualmente)</w:t>
+      </w:r>
+    </w:p>
+    <w:p>
+      <w:pPr>
+        <w:pBdr>
+          <w:top w:val="single" w:sz="2" w:space="0" w:color="auto"/>
+          <w:left w:val="single" w:sz="2" w:space="0" w:color="auto"/>
+          <w:bottom w:val="single" w:sz="2" w:space="0" w:color="auto"/>
+          <w:right w:val="single" w:sz="2" w:space="0" w:color="auto"/>
+        </w:pBdr>
+        <w:spacing w:before="100" w:beforeAutospacing="1" w:after="100" w:afterAutospacing="1" w:line="240" w:lineRule="auto"/>
+        <w:rPr>
+          <w:rFonts w:ascii="Segoe UI" w:eastAsia="Times New Roman" w:hAnsi="Segoe UI" w:cs="Segoe UI"/>
+          <w:spacing w:val="2"/>
+          <w:kern w:val="0"/>
+          <w:sz w:val="24"/>
+          <w:szCs w:val="24"/>
+          <w:lang w:eastAsia="es-MX"/>
+          <w14:ligatures w14:val="none"/>
+        </w:rPr>
+      </w:pPr>
+      <w:r>
+        <w:rPr>
+          <w:rFonts w:ascii="Segoe UI" w:eastAsia="Times New Roman" w:hAnsi="Segoe UI" w:cs="Segoe UI"/>
+          <w:spacing w:val="2"/>
+          <w:kern w:val="0"/>
+          <w:sz w:val="24"/>
+          <w:szCs w:val="24"/>
+          <w:lang w:eastAsia="es-MX"/>
+          <w14:ligatures w14:val="none"/>
+        </w:rPr>
+        <w:t>Aquí entras en la definición técnica pero accesible.</w:t>
+      </w:r>
+    </w:p>
+    <w:p>
+      <w:pPr>
+        <w:numPr>
+          <w:ilvl w:val="0"/>
+          <w:numId w:val="4"/>
+        </w:numPr>
+        <w:pBdr>
+          <w:top w:val="single" w:sz="2" w:space="0" w:color="auto"/>
+          <w:left w:val="single" w:sz="2" w:space="0" w:color="auto"/>
+          <w:bottom w:val="single" w:sz="2" w:space="0" w:color="auto"/>
+          <w:right w:val="single" w:sz="2" w:space="0" w:color="auto"/>
+        </w:pBdr>
+        <w:spacing w:before="100" w:beforeAutospacing="1" w:after="100" w:afterAutospacing="1" w:line="240" w:lineRule="auto"/>
+        <w:rPr>
+          <w:rFonts w:ascii="Segoe UI" w:eastAsia="Times New Roman" w:hAnsi="Segoe UI" w:cs="Segoe UI"/>
+          <w:spacing w:val="2"/>
+          <w:kern w:val="0"/>
+          <w:sz w:val="24"/>
+          <w:szCs w:val="24"/>
+          <w:lang w:eastAsia="es-MX"/>
+          <w14:ligatures w14:val="none"/>
+        </w:rPr>
+      </w:pPr>
+      <w:r>
+        <w:rPr>
+          <w:rFonts w:ascii="Segoe UI" w:eastAsia="Times New Roman" w:hAnsi="Segoe UI" w:cs="Segoe UI"/>
+          <w:b/>
+          <w:bCs/>
+          <w:spacing w:val="2"/>
+          <w:kern w:val="0"/>
+          <w:sz w:val="24"/>
+          <w:szCs w:val="24"/>
+          <w:bdr w:val="single" w:sz="2" w:space="0" w:color="auto" w:frame="1"/>
+          <w:lang w:eastAsia="es-MX"/>
+          <w14:ligatures w14:val="none"/>
+        </w:rPr>
+        <w:t>Qué decir:</w:t>
+      </w:r>
+    </w:p>
+    <w:p>
+      <w:pPr>
+        <w:numPr>
+          <w:ilvl w:val="1"/>
+          <w:numId w:val="4"/>
+        </w:numPr>
+        <w:pBdr>
+          <w:top w:val="single" w:sz="2" w:space="0" w:color="auto"/>
+          <w:left w:val="single" w:sz="2" w:space="0" w:color="auto"/>
+          <w:bottom w:val="single" w:sz="2" w:space="0" w:color="auto"/>
+          <w:right w:val="single" w:sz="2" w:space="0" w:color="auto"/>
+        </w:pBdr>
+        <w:spacing w:before="100" w:beforeAutospacing="1" w:after="100" w:afterAutospacing="1" w:line="240" w:lineRule="auto"/>
+        <w:rPr>
+          <w:rFonts w:ascii="Segoe UI" w:eastAsia="Times New Roman" w:hAnsi="Segoe UI" w:cs="Segoe UI"/>
+          <w:spacing w:val="2"/>
+          <w:kern w:val="0"/>
+          <w:sz w:val="24"/>
+          <w:szCs w:val="24"/>
+          <w:lang w:eastAsia="es-MX"/>
+          <w14:ligatures w14:val="none"/>
+        </w:rPr>
+      </w:pPr>
+      <w:r>
+        <w:rPr>
+          <w:rFonts w:ascii="Segoe UI" w:eastAsia="Times New Roman" w:hAnsi="Segoe UI" w:cs="Segoe UI"/>
+          <w:spacing w:val="2"/>
+          <w:kern w:val="0"/>
+          <w:sz w:val="24"/>
+          <w:szCs w:val="24"/>
+          <w:lang w:eastAsia="es-MX"/>
+          <w14:ligatures w14:val="none"/>
+        </w:rPr>
+        <w:t>Defínelo como una técnica </w:t>
+      </w:r>
+      <w:r>
+        <w:rPr>
+          <w:rFonts w:ascii="Segoe UI" w:eastAsia="Times New Roman" w:hAnsi="Segoe UI" w:cs="Segoe UI"/>
+          <w:b/>
+          <w:bCs/>
+          <w:spacing w:val="2"/>
+          <w:kern w:val="0"/>
+          <w:sz w:val="24"/>
+          <w:szCs w:val="24"/>
+          <w:bdr w:val="single" w:sz="2" w:space="0" w:color="auto" w:frame="1"/>
+          <w:lang w:eastAsia="es-MX"/>
+          <w14:ligatures w14:val="none"/>
+        </w:rPr>
+        <w:t>no supervisada</w:t>
+      </w:r>
+      <w:r>
+        <w:rPr>
+          <w:rFonts w:ascii="Segoe UI" w:eastAsia="Times New Roman" w:hAnsi="Segoe UI" w:cs="Segoe UI"/>
+          <w:spacing w:val="2"/>
+          <w:kern w:val="0"/>
+          <w:sz w:val="24"/>
+          <w:szCs w:val="24"/>
+          <w:lang w:eastAsia="es-MX"/>
+          <w14:ligatures w14:val="none"/>
+        </w:rPr>
+        <w:t> (no le dices al algoritmo qué es cada muestra, él encuentra patrones por sí solo).</w:t>
+      </w:r>
+    </w:p>
+    <w:p>
+      <w:pPr>
+        <w:numPr>
+          <w:ilvl w:val="1"/>
+          <w:numId w:val="4"/>
+        </w:numPr>
+        <w:pBdr>
+          <w:top w:val="single" w:sz="2" w:space="0" w:color="auto"/>
+          <w:left w:val="single" w:sz="2" w:space="0" w:color="auto"/>
+          <w:bottom w:val="single" w:sz="2" w:space="0" w:color="auto"/>
+          <w:right w:val="single" w:sz="2" w:space="0" w:color="auto"/>
+        </w:pBdr>
+        <w:spacing w:before="100" w:beforeAutospacing="1" w:after="100" w:afterAutospacing="1" w:line="240" w:lineRule="auto"/>
+        <w:rPr>
+          <w:rFonts w:ascii="Segoe UI" w:eastAsia="Times New Roman" w:hAnsi="Segoe UI" w:cs="Segoe UI"/>
+          <w:spacing w:val="2"/>
+          <w:kern w:val="0"/>
+          <w:sz w:val="24"/>
+          <w:szCs w:val="24"/>
+          <w:lang w:eastAsia="es-MX"/>
+          <w14:ligatures w14:val="none"/>
+        </w:rPr>
+      </w:pPr>
+      <w:r>
+        <w:rPr>
+          <w:rFonts w:ascii="Segoe UI" w:eastAsia="Times New Roman" w:hAnsi="Segoe UI" w:cs="Segoe UI"/>
+          <w:spacing w:val="2"/>
+          <w:kern w:val="0"/>
+          <w:sz w:val="24"/>
+          <w:szCs w:val="24"/>
+          <w:lang w:eastAsia="es-MX"/>
+          <w14:ligatures w14:val="none"/>
+        </w:rPr>
+        <w:t>El objetivo es reducir la complejidad: pasar de miles de variables (números de onda) a unas pocas nuevas variables llamadas </w:t>
+      </w:r>
+      <w:r>
+        <w:rPr>
+          <w:rFonts w:ascii="Segoe UI" w:eastAsia="Times New Roman" w:hAnsi="Segoe UI" w:cs="Segoe UI"/>
+          <w:b/>
+          <w:bCs/>
+          <w:spacing w:val="2"/>
+          <w:kern w:val="0"/>
+          <w:sz w:val="24"/>
+          <w:szCs w:val="24"/>
+          <w:bdr w:val="single" w:sz="2" w:space="0" w:color="auto" w:frame="1"/>
+          <w:lang w:eastAsia="es-MX"/>
+          <w14:ligatures w14:val="none"/>
+        </w:rPr>
+        <w:t>Componentes Principales (PCs)</w:t>
+      </w:r>
+      <w:r>
+        <w:rPr>
+          <w:rFonts w:ascii="Segoe UI" w:eastAsia="Times New Roman" w:hAnsi="Segoe UI" w:cs="Segoe UI"/>
+          <w:spacing w:val="2"/>
+          <w:kern w:val="0"/>
+          <w:sz w:val="24"/>
+          <w:szCs w:val="24"/>
+          <w:lang w:eastAsia="es-MX"/>
+          <w14:ligatures w14:val="none"/>
+        </w:rPr>
+        <w:t>.</w:t>
+      </w:r>
+    </w:p>
+    <w:p>
+      <w:pPr>
+        <w:numPr>
+          <w:ilvl w:val="1"/>
+          <w:numId w:val="4"/>
+        </w:numPr>
+        <w:pBdr>
+          <w:top w:val="single" w:sz="2" w:space="0" w:color="auto"/>
+          <w:left w:val="single" w:sz="2" w:space="0" w:color="auto"/>
+          <w:bottom w:val="single" w:sz="2" w:space="0" w:color="auto"/>
+          <w:right w:val="single" w:sz="2" w:space="0" w:color="auto"/>
+        </w:pBdr>
+        <w:spacing w:before="100" w:beforeAutospacing="1" w:after="100" w:afterAutospacing="1" w:line="240" w:lineRule="auto"/>
+        <w:rPr>
+          <w:rFonts w:ascii="Segoe UI" w:eastAsia="Times New Roman" w:hAnsi="Segoe UI" w:cs="Segoe UI"/>
+          <w:spacing w:val="2"/>
+          <w:kern w:val="0"/>
+          <w:sz w:val="24"/>
+          <w:szCs w:val="24"/>
+          <w:lang w:eastAsia="es-MX"/>
+          <w14:ligatures w14:val="none"/>
+        </w:rPr>
+      </w:pPr>
+      <w:r>
+        <w:rPr>
+          <w:rFonts w:ascii="Segoe UI" w:eastAsia="Times New Roman" w:hAnsi="Segoe UI" w:cs="Segoe UI"/>
+          <w:spacing w:val="2"/>
+          <w:kern w:val="0"/>
+          <w:sz w:val="24"/>
+          <w:szCs w:val="24"/>
+          <w:lang w:eastAsia="es-MX"/>
+          <w14:ligatures w14:val="none"/>
+        </w:rPr>
+        <w:t>Explica que el PCA busca la dirección de </w:t>
+      </w:r>
+      <w:r>
+        <w:rPr>
+          <w:rFonts w:ascii="Segoe UI" w:eastAsia="Times New Roman" w:hAnsi="Segoe UI" w:cs="Segoe UI"/>
+          <w:b/>
+          <w:bCs/>
+          <w:spacing w:val="2"/>
+          <w:kern w:val="0"/>
+          <w:sz w:val="24"/>
+          <w:szCs w:val="24"/>
+          <w:bdr w:val="single" w:sz="2" w:space="0" w:color="auto" w:frame="1"/>
+          <w:lang w:eastAsia="es-MX"/>
+          <w14:ligatures w14:val="none"/>
+        </w:rPr>
+        <w:t>máxima varianza</w:t>
+      </w:r>
+      <w:r>
+        <w:rPr>
+          <w:rFonts w:ascii="Segoe UI" w:eastAsia="Times New Roman" w:hAnsi="Segoe UI" w:cs="Segoe UI"/>
+          <w:spacing w:val="2"/>
+          <w:kern w:val="0"/>
+          <w:sz w:val="24"/>
+          <w:szCs w:val="24"/>
+          <w:lang w:eastAsia="es-MX"/>
+          <w14:ligatures w14:val="none"/>
+        </w:rPr>
+        <w:t>. Es decir, ¿en qué se diferencian más mis muestras entre sí?</w:t>
+      </w:r>
+    </w:p>
+    <w:p>
+      <w:pPr>
+        <w:pBdr>
+          <w:top w:val="single" w:sz="2" w:space="0" w:color="auto"/>
+          <w:left w:val="single" w:sz="2" w:space="0" w:color="auto"/>
+          <w:bottom w:val="single" w:sz="2" w:space="0" w:color="auto"/>
+          <w:right w:val="single" w:sz="2" w:space="0" w:color="auto"/>
+        </w:pBdr>
+        <w:spacing w:before="100" w:beforeAutospacing="1" w:after="100" w:afterAutospacing="1" w:line="240" w:lineRule="auto"/>
+        <w:outlineLvl w:val="1"/>
+        <w:rPr>
+          <w:rFonts w:ascii="Segoe UI" w:eastAsia="Times New Roman" w:hAnsi="Segoe UI" w:cs="Segoe UI"/>
+          <w:b/>
+          <w:bCs/>
+          <w:spacing w:val="2"/>
+          <w:kern w:val="0"/>
+          <w:sz w:val="36"/>
+          <w:szCs w:val="36"/>
+          <w:lang w:eastAsia="es-MX"/>
+          <w14:ligatures w14:val="none"/>
+        </w:rPr>
+      </w:pPr>
+      <w:r>
+        <w:rPr>
+          <w:rFonts w:ascii="Segoe UI" w:eastAsia="Times New Roman" w:hAnsi="Segoe UI" w:cs="Segoe UI"/>
+          <w:b/>
+          <w:bCs/>
+          <w:spacing w:val="2"/>
+          <w:kern w:val="0"/>
+          <w:sz w:val="36"/>
+          <w:szCs w:val="36"/>
+          <w:lang w:eastAsia="es-MX"/>
+          <w14:ligatures w14:val="none"/>
+        </w:rPr>
+        <w:t>4. La Matemática "Light" (Transformación Ortogonal)</w:t>
+      </w:r>
+    </w:p>
+    <w:p>
+      <w:pPr>
+        <w:pBdr>
+          <w:top w:val="single" w:sz="2" w:space="0" w:color="auto"/>
+          <w:left w:val="single" w:sz="2" w:space="0" w:color="auto"/>
+          <w:bottom w:val="single" w:sz="2" w:space="0" w:color="auto"/>
+          <w:right w:val="single" w:sz="2" w:space="0" w:color="auto"/>
+        </w:pBdr>
+        <w:spacing w:before="100" w:beforeAutospacing="1" w:after="100" w:afterAutospacing="1" w:line="240" w:lineRule="auto"/>
+        <w:rPr>
+          <w:rFonts w:ascii="Segoe UI" w:eastAsia="Times New Roman" w:hAnsi="Segoe UI" w:cs="Segoe UI"/>
+          <w:spacing w:val="2"/>
+          <w:kern w:val="0"/>
+          <w:sz w:val="24"/>
+          <w:szCs w:val="24"/>
+          <w:lang w:eastAsia="es-MX"/>
+          <w14:ligatures w14:val="none"/>
+        </w:rPr>
+      </w:pPr>
+      <w:r>
+        <w:rPr>
+          <w:rFonts w:ascii="Segoe UI" w:eastAsia="Times New Roman" w:hAnsi="Segoe UI" w:cs="Segoe UI"/>
+          <w:spacing w:val="2"/>
+          <w:kern w:val="0"/>
+          <w:sz w:val="24"/>
+          <w:szCs w:val="24"/>
+          <w:lang w:eastAsia="es-MX"/>
+          <w14:ligatures w14:val="none"/>
+        </w:rPr>
+        <w:t>No necesitas poner todas las ecuaciones matriciales al principio, pero sí explicar la lógica.</w:t>
+      </w:r>
+    </w:p>
+    <w:p>
+      <w:pPr>
+        <w:numPr>
+          <w:ilvl w:val="0"/>
+          <w:numId w:val="5"/>
+        </w:numPr>
+        <w:pBdr>
+          <w:top w:val="single" w:sz="2" w:space="0" w:color="auto"/>
+          <w:left w:val="single" w:sz="2" w:space="0" w:color="auto"/>
+          <w:bottom w:val="single" w:sz="2" w:space="0" w:color="auto"/>
+          <w:right w:val="single" w:sz="2" w:space="0" w:color="auto"/>
+        </w:pBdr>
+        <w:spacing w:before="100" w:beforeAutospacing="1" w:after="100" w:afterAutospacing="1" w:line="240" w:lineRule="auto"/>
+        <w:rPr>
+          <w:rFonts w:ascii="Segoe UI" w:eastAsia="Times New Roman" w:hAnsi="Segoe UI" w:cs="Segoe UI"/>
+          <w:spacing w:val="2"/>
+          <w:kern w:val="0"/>
+          <w:sz w:val="24"/>
+          <w:szCs w:val="24"/>
+          <w:lang w:eastAsia="es-MX"/>
+          <w14:ligatures w14:val="none"/>
+        </w:rPr>
+      </w:pPr>
+      <w:r>
+        <w:rPr>
+          <w:rFonts w:ascii="Segoe UI" w:eastAsia="Times New Roman" w:hAnsi="Segoe UI" w:cs="Segoe UI"/>
+          <w:b/>
+          <w:bCs/>
+          <w:spacing w:val="2"/>
+          <w:kern w:val="0"/>
+          <w:sz w:val="24"/>
+          <w:szCs w:val="24"/>
+          <w:bdr w:val="single" w:sz="2" w:space="0" w:color="auto" w:frame="1"/>
+          <w:lang w:eastAsia="es-MX"/>
+          <w14:ligatures w14:val="none"/>
+        </w:rPr>
+        <w:t>Qué decir:</w:t>
+      </w:r>
+    </w:p>
+    <w:p>
+      <w:pPr>
+        <w:numPr>
+          <w:ilvl w:val="1"/>
+          <w:numId w:val="5"/>
+        </w:numPr>
+        <w:pBdr>
+          <w:top w:val="single" w:sz="2" w:space="0" w:color="auto"/>
+          <w:left w:val="single" w:sz="2" w:space="0" w:color="auto"/>
+          <w:bottom w:val="single" w:sz="2" w:space="0" w:color="auto"/>
+          <w:right w:val="single" w:sz="2" w:space="0" w:color="auto"/>
+        </w:pBdr>
+        <w:spacing w:before="100" w:beforeAutospacing="1" w:after="100" w:afterAutospacing="1" w:line="240" w:lineRule="auto"/>
+        <w:rPr>
+          <w:rFonts w:ascii="Segoe UI" w:eastAsia="Times New Roman" w:hAnsi="Segoe UI" w:cs="Segoe UI"/>
+          <w:spacing w:val="2"/>
+          <w:kern w:val="0"/>
+          <w:sz w:val="24"/>
+          <w:szCs w:val="24"/>
+          <w:lang w:eastAsia="es-MX"/>
+          <w14:ligatures w14:val="none"/>
+        </w:rPr>
+      </w:pPr>
+      <w:r>
+        <w:rPr>
+          <w:rFonts w:ascii="Segoe UI" w:eastAsia="Times New Roman" w:hAnsi="Segoe UI" w:cs="Segoe UI"/>
+          <w:spacing w:val="2"/>
+          <w:kern w:val="0"/>
+          <w:sz w:val="24"/>
+          <w:szCs w:val="24"/>
+          <w:lang w:eastAsia="es-MX"/>
+          <w14:ligatures w14:val="none"/>
+        </w:rPr>
+        <w:t>El PCA rota los ejes originales para crear nuevos ejes ortogonales (perpendiculares).</w:t>
+      </w:r>
+    </w:p>
+    <w:p>
+      <w:pPr>
+        <w:numPr>
+          <w:ilvl w:val="1"/>
+          <w:numId w:val="5"/>
+        </w:numPr>
+        <w:pBdr>
+          <w:top w:val="single" w:sz="2" w:space="0" w:color="auto"/>
+          <w:left w:val="single" w:sz="2" w:space="0" w:color="auto"/>
+          <w:bottom w:val="single" w:sz="2" w:space="0" w:color="auto"/>
+          <w:right w:val="single" w:sz="2" w:space="0" w:color="auto"/>
+        </w:pBdr>
+        <w:spacing w:before="100" w:beforeAutospacing="1" w:after="100" w:afterAutospacing="1" w:line="240" w:lineRule="auto"/>
+        <w:rPr>
+          <w:rFonts w:ascii="Segoe UI" w:eastAsia="Times New Roman" w:hAnsi="Segoe UI" w:cs="Segoe UI"/>
+          <w:spacing w:val="2"/>
+          <w:kern w:val="0"/>
+          <w:sz w:val="24"/>
+          <w:szCs w:val="24"/>
+          <w:lang w:eastAsia="es-MX"/>
+          <w14:ligatures w14:val="none"/>
+        </w:rPr>
+      </w:pPr>
+      <w:r>
+        <w:rPr>
+          <w:rFonts w:ascii="Segoe UI" w:eastAsia="Times New Roman" w:hAnsi="Segoe UI" w:cs="Segoe UI"/>
+          <w:b/>
+          <w:bCs/>
+          <w:spacing w:val="2"/>
+          <w:kern w:val="0"/>
+          <w:sz w:val="24"/>
+          <w:szCs w:val="24"/>
+          <w:bdr w:val="single" w:sz="2" w:space="0" w:color="auto" w:frame="1"/>
+          <w:lang w:eastAsia="es-MX"/>
+          <w14:ligatures w14:val="none"/>
+        </w:rPr>
+        <w:t>PC1 (Componente Principal 1):</w:t>
+      </w:r>
+      <w:r>
+        <w:rPr>
+          <w:rFonts w:ascii="Segoe UI" w:eastAsia="Times New Roman" w:hAnsi="Segoe UI" w:cs="Segoe UI"/>
+          <w:spacing w:val="2"/>
+          <w:kern w:val="0"/>
+          <w:sz w:val="24"/>
+          <w:szCs w:val="24"/>
+          <w:lang w:eastAsia="es-MX"/>
+          <w14:ligatures w14:val="none"/>
+        </w:rPr>
+        <w:t> Contiene la mayor parte de la información (varianza) del sistema (ej. 70-80%).</w:t>
+      </w:r>
+    </w:p>
+    <w:p>
+      <w:pPr>
+        <w:numPr>
+          <w:ilvl w:val="1"/>
+          <w:numId w:val="5"/>
+        </w:numPr>
+        <w:pBdr>
+          <w:top w:val="single" w:sz="2" w:space="0" w:color="auto"/>
+          <w:left w:val="single" w:sz="2" w:space="0" w:color="auto"/>
+          <w:bottom w:val="single" w:sz="2" w:space="0" w:color="auto"/>
+          <w:right w:val="single" w:sz="2" w:space="0" w:color="auto"/>
+        </w:pBdr>
+        <w:spacing w:before="100" w:beforeAutospacing="1" w:after="100" w:afterAutospacing="1" w:line="240" w:lineRule="auto"/>
+        <w:rPr>
+          <w:rFonts w:ascii="Segoe UI" w:eastAsia="Times New Roman" w:hAnsi="Segoe UI" w:cs="Segoe UI"/>
+          <w:spacing w:val="2"/>
+          <w:kern w:val="0"/>
+          <w:sz w:val="24"/>
+          <w:szCs w:val="24"/>
+          <w:lang w:eastAsia="es-MX"/>
+          <w14:ligatures w14:val="none"/>
+        </w:rPr>
+      </w:pPr>
+      <w:r>
+        <w:rPr>
+          <w:rFonts w:ascii="Segoe UI" w:eastAsia="Times New Roman" w:hAnsi="Segoe UI" w:cs="Segoe UI"/>
+          <w:b/>
+          <w:bCs/>
+          <w:spacing w:val="2"/>
+          <w:kern w:val="0"/>
+          <w:sz w:val="24"/>
+          <w:szCs w:val="24"/>
+          <w:bdr w:val="single" w:sz="2" w:space="0" w:color="auto" w:frame="1"/>
+          <w:lang w:eastAsia="es-MX"/>
+          <w14:ligatures w14:val="none"/>
+        </w:rPr>
+        <w:t>PC2:</w:t>
+      </w:r>
+      <w:r>
+        <w:rPr>
+          <w:rFonts w:ascii="Segoe UI" w:eastAsia="Times New Roman" w:hAnsi="Segoe UI" w:cs="Segoe UI"/>
+          <w:spacing w:val="2"/>
+          <w:kern w:val="0"/>
+          <w:sz w:val="24"/>
+          <w:szCs w:val="24"/>
+          <w:lang w:eastAsia="es-MX"/>
+          <w14:ligatures w14:val="none"/>
+        </w:rPr>
+        <w:t> Contiene la segunda mayor fuente de variación que no explicó el PC1, y así sucesivamente.</w:t>
+      </w:r>
+    </w:p>
+    <w:p>
+      <w:pPr>
+        <w:numPr>
+          <w:ilvl w:val="1"/>
+          <w:numId w:val="5"/>
+        </w:numPr>
+        <w:pBdr>
+          <w:top w:val="single" w:sz="2" w:space="0" w:color="auto"/>
+          <w:left w:val="single" w:sz="2" w:space="0" w:color="auto"/>
+          <w:bottom w:val="single" w:sz="2" w:space="0" w:color="auto"/>
+          <w:right w:val="single" w:sz="2" w:space="0" w:color="auto"/>
+        </w:pBdr>
+        <w:spacing w:before="100" w:beforeAutospacing="1" w:after="100" w:afterAutospacing="1" w:line="240" w:lineRule="auto"/>
+        <w:rPr>
+          <w:rFonts w:ascii="Segoe UI" w:eastAsia="Times New Roman" w:hAnsi="Segoe UI" w:cs="Segoe UI"/>
+          <w:spacing w:val="2"/>
+          <w:kern w:val="0"/>
+          <w:sz w:val="24"/>
+          <w:szCs w:val="24"/>
+          <w:lang w:eastAsia="es-MX"/>
+          <w14:ligatures w14:val="none"/>
+        </w:rPr>
+      </w:pPr>
+      <w:r>
+        <w:rPr>
+          <w:rFonts w:ascii="Segoe UI" w:eastAsia="Times New Roman" w:hAnsi="Segoe UI" w:cs="Segoe UI"/>
+          <w:spacing w:val="2"/>
+          <w:kern w:val="0"/>
+          <w:sz w:val="24"/>
+          <w:szCs w:val="24"/>
+          <w:lang w:eastAsia="es-MX"/>
+          <w14:ligatures w14:val="none"/>
+        </w:rPr>
+        <w:t>Esto permite explicar el 95% de lo que pasa en tu experimento con solo 2 o 3 gráficos, en lugar de miles.</w:t>
+      </w:r>
+    </w:p>
+    <w:p>
+      <w:pPr>
+        <w:pBdr>
+          <w:top w:val="single" w:sz="2" w:space="0" w:color="auto"/>
+          <w:left w:val="single" w:sz="2" w:space="0" w:color="auto"/>
+          <w:bottom w:val="single" w:sz="2" w:space="0" w:color="auto"/>
+          <w:right w:val="single" w:sz="2" w:space="0" w:color="auto"/>
+        </w:pBdr>
+        <w:spacing w:before="100" w:beforeAutospacing="1" w:after="100" w:afterAutospacing="1" w:line="240" w:lineRule="auto"/>
+        <w:outlineLvl w:val="1"/>
+        <w:rPr>
+          <w:rFonts w:ascii="Segoe UI" w:eastAsia="Times New Roman" w:hAnsi="Segoe UI" w:cs="Segoe UI"/>
+          <w:b/>
+          <w:bCs/>
+          <w:spacing w:val="2"/>
+          <w:kern w:val="0"/>
+          <w:sz w:val="36"/>
+          <w:szCs w:val="36"/>
+          <w:lang w:eastAsia="es-MX"/>
+          <w14:ligatures w14:val="none"/>
+        </w:rPr>
+      </w:pPr>
+      <w:r>
+        <w:rPr>
+          <w:rFonts w:ascii="Segoe UI" w:eastAsia="Times New Roman" w:hAnsi="Segoe UI" w:cs="Segoe UI"/>
+          <w:b/>
+          <w:bCs/>
+          <w:spacing w:val="2"/>
+          <w:kern w:val="0"/>
+          <w:sz w:val="36"/>
+          <w:szCs w:val="36"/>
+          <w:lang w:eastAsia="es-MX"/>
+          <w14:ligatures w14:val="none"/>
+        </w:rPr>
+        <w:lastRenderedPageBreak/>
+        <w:t>5. Interpretación: Scores vs. Loadings (El corazón del análisis)</w:t>
+      </w:r>
+    </w:p>
+    <w:p>
+      <w:pPr>
+        <w:pBdr>
+          <w:top w:val="single" w:sz="2" w:space="0" w:color="auto"/>
+          <w:left w:val="single" w:sz="2" w:space="0" w:color="auto"/>
+          <w:bottom w:val="single" w:sz="2" w:space="0" w:color="auto"/>
+          <w:right w:val="single" w:sz="2" w:space="0" w:color="auto"/>
+        </w:pBdr>
+        <w:spacing w:before="100" w:beforeAutospacing="1" w:after="100" w:afterAutospacing="1" w:line="240" w:lineRule="auto"/>
+        <w:rPr>
+          <w:rFonts w:ascii="Segoe UI" w:eastAsia="Times New Roman" w:hAnsi="Segoe UI" w:cs="Segoe UI"/>
+          <w:spacing w:val="2"/>
+          <w:kern w:val="0"/>
+          <w:sz w:val="24"/>
+          <w:szCs w:val="24"/>
+          <w:lang w:eastAsia="es-MX"/>
+          <w14:ligatures w14:val="none"/>
+        </w:rPr>
+      </w:pPr>
+      <w:r>
+        <w:rPr>
+          <w:rFonts w:ascii="Segoe UI" w:eastAsia="Times New Roman" w:hAnsi="Segoe UI" w:cs="Segoe UI"/>
+          <w:spacing w:val="2"/>
+          <w:kern w:val="0"/>
+          <w:sz w:val="24"/>
+          <w:szCs w:val="24"/>
+          <w:lang w:eastAsia="es-MX"/>
+          <w14:ligatures w14:val="none"/>
+        </w:rPr>
+        <w:t>Esta es la parte más importante para tu discusión de resultados más adelante. Debes definir estos dos términos claramente.</w:t>
+      </w:r>
+    </w:p>
+    <w:p>
+      <w:pPr>
+        <w:numPr>
+          <w:ilvl w:val="0"/>
+          <w:numId w:val="6"/>
+        </w:numPr>
+        <w:pBdr>
+          <w:top w:val="single" w:sz="2" w:space="0" w:color="auto"/>
+          <w:left w:val="single" w:sz="2" w:space="0" w:color="auto"/>
+          <w:bottom w:val="single" w:sz="2" w:space="0" w:color="auto"/>
+          <w:right w:val="single" w:sz="2" w:space="0" w:color="auto"/>
+        </w:pBdr>
+        <w:spacing w:before="100" w:beforeAutospacing="1" w:after="100" w:afterAutospacing="1" w:line="240" w:lineRule="auto"/>
+        <w:rPr>
+          <w:rFonts w:ascii="Segoe UI" w:eastAsia="Times New Roman" w:hAnsi="Segoe UI" w:cs="Segoe UI"/>
+          <w:spacing w:val="2"/>
+          <w:kern w:val="0"/>
+          <w:sz w:val="24"/>
+          <w:szCs w:val="24"/>
+          <w:lang w:eastAsia="es-MX"/>
+          <w14:ligatures w14:val="none"/>
+        </w:rPr>
+      </w:pPr>
+      <w:r>
+        <w:rPr>
+          <w:rFonts w:ascii="Segoe UI" w:eastAsia="Times New Roman" w:hAnsi="Segoe UI" w:cs="Segoe UI"/>
+          <w:b/>
+          <w:bCs/>
+          <w:spacing w:val="2"/>
+          <w:kern w:val="0"/>
+          <w:sz w:val="24"/>
+          <w:szCs w:val="24"/>
+          <w:bdr w:val="single" w:sz="2" w:space="0" w:color="auto" w:frame="1"/>
+          <w:lang w:eastAsia="es-MX"/>
+          <w14:ligatures w14:val="none"/>
+        </w:rPr>
+        <w:t>Gráfico de Scores (Puntajes):</w:t>
+      </w:r>
+    </w:p>
+    <w:p>
+      <w:pPr>
+        <w:numPr>
+          <w:ilvl w:val="1"/>
+          <w:numId w:val="6"/>
+        </w:numPr>
+        <w:pBdr>
+          <w:top w:val="single" w:sz="2" w:space="0" w:color="auto"/>
+          <w:left w:val="single" w:sz="2" w:space="0" w:color="auto"/>
+          <w:bottom w:val="single" w:sz="2" w:space="0" w:color="auto"/>
+          <w:right w:val="single" w:sz="2" w:space="0" w:color="auto"/>
+        </w:pBdr>
+        <w:spacing w:before="100" w:beforeAutospacing="1" w:after="100" w:afterAutospacing="1" w:line="240" w:lineRule="auto"/>
+        <w:rPr>
+          <w:rFonts w:ascii="Segoe UI" w:eastAsia="Times New Roman" w:hAnsi="Segoe UI" w:cs="Segoe UI"/>
+          <w:spacing w:val="2"/>
+          <w:kern w:val="0"/>
+          <w:sz w:val="24"/>
+          <w:szCs w:val="24"/>
+          <w:lang w:eastAsia="es-MX"/>
+          <w14:ligatures w14:val="none"/>
+        </w:rPr>
+      </w:pPr>
+      <w:r>
+        <w:rPr>
+          <w:rFonts w:ascii="Segoe UI" w:eastAsia="Times New Roman" w:hAnsi="Segoe UI" w:cs="Segoe UI"/>
+          <w:spacing w:val="2"/>
+          <w:kern w:val="0"/>
+          <w:sz w:val="24"/>
+          <w:szCs w:val="24"/>
+          <w:lang w:eastAsia="es-MX"/>
+          <w14:ligatures w14:val="none"/>
+        </w:rPr>
+        <w:t>Representa a las </w:t>
+      </w:r>
+      <w:r>
+        <w:rPr>
+          <w:rFonts w:ascii="Segoe UI" w:eastAsia="Times New Roman" w:hAnsi="Segoe UI" w:cs="Segoe UI"/>
+          <w:b/>
+          <w:bCs/>
+          <w:spacing w:val="2"/>
+          <w:kern w:val="0"/>
+          <w:sz w:val="24"/>
+          <w:szCs w:val="24"/>
+          <w:bdr w:val="single" w:sz="2" w:space="0" w:color="auto" w:frame="1"/>
+          <w:lang w:eastAsia="es-MX"/>
+          <w14:ligatures w14:val="none"/>
+        </w:rPr>
+        <w:t>muestras</w:t>
+      </w:r>
+      <w:r>
+        <w:rPr>
+          <w:rFonts w:ascii="Segoe UI" w:eastAsia="Times New Roman" w:hAnsi="Segoe UI" w:cs="Segoe UI"/>
+          <w:spacing w:val="2"/>
+          <w:kern w:val="0"/>
+          <w:sz w:val="24"/>
+          <w:szCs w:val="24"/>
+          <w:lang w:eastAsia="es-MX"/>
+          <w14:ligatures w14:val="none"/>
+        </w:rPr>
+        <w:t>.</w:t>
+      </w:r>
+    </w:p>
+    <w:p>
+      <w:pPr>
+        <w:numPr>
+          <w:ilvl w:val="1"/>
+          <w:numId w:val="6"/>
+        </w:numPr>
+        <w:pBdr>
+          <w:top w:val="single" w:sz="2" w:space="0" w:color="auto"/>
+          <w:left w:val="single" w:sz="2" w:space="0" w:color="auto"/>
+          <w:bottom w:val="single" w:sz="2" w:space="0" w:color="auto"/>
+          <w:right w:val="single" w:sz="2" w:space="0" w:color="auto"/>
+        </w:pBdr>
+        <w:spacing w:before="100" w:beforeAutospacing="1" w:after="100" w:afterAutospacing="1" w:line="240" w:lineRule="auto"/>
+        <w:rPr>
+          <w:rFonts w:ascii="Segoe UI" w:eastAsia="Times New Roman" w:hAnsi="Segoe UI" w:cs="Segoe UI"/>
+          <w:spacing w:val="2"/>
+          <w:kern w:val="0"/>
+          <w:sz w:val="24"/>
+          <w:szCs w:val="24"/>
+          <w:lang w:eastAsia="es-MX"/>
+          <w14:ligatures w14:val="none"/>
+        </w:rPr>
+      </w:pPr>
+      <w:r>
+        <w:rPr>
+          <w:rFonts w:ascii="Segoe UI" w:eastAsia="Times New Roman" w:hAnsi="Segoe UI" w:cs="Segoe UI"/>
+          <w:spacing w:val="2"/>
+          <w:kern w:val="0"/>
+          <w:sz w:val="24"/>
+          <w:szCs w:val="24"/>
+          <w:lang w:eastAsia="es-MX"/>
+          <w14:ligatures w14:val="none"/>
+        </w:rPr>
+        <w:t>Si dos puntos están cerca en el gráfico, sus espectros son químicamente similares.</w:t>
+      </w:r>
+    </w:p>
+    <w:p>
+      <w:pPr>
+        <w:numPr>
+          <w:ilvl w:val="1"/>
+          <w:numId w:val="6"/>
+        </w:numPr>
+        <w:pBdr>
+          <w:top w:val="single" w:sz="2" w:space="0" w:color="auto"/>
+          <w:left w:val="single" w:sz="2" w:space="0" w:color="auto"/>
+          <w:bottom w:val="single" w:sz="2" w:space="0" w:color="auto"/>
+          <w:right w:val="single" w:sz="2" w:space="0" w:color="auto"/>
+        </w:pBdr>
+        <w:spacing w:before="100" w:beforeAutospacing="1" w:after="100" w:afterAutospacing="1" w:line="240" w:lineRule="auto"/>
+        <w:rPr>
+          <w:rFonts w:ascii="Segoe UI" w:eastAsia="Times New Roman" w:hAnsi="Segoe UI" w:cs="Segoe UI"/>
+          <w:spacing w:val="2"/>
+          <w:kern w:val="0"/>
+          <w:sz w:val="24"/>
+          <w:szCs w:val="24"/>
+          <w:lang w:eastAsia="es-MX"/>
+          <w14:ligatures w14:val="none"/>
+        </w:rPr>
+      </w:pPr>
+      <w:r>
+        <w:rPr>
+          <w:rFonts w:ascii="Segoe UI" w:eastAsia="Times New Roman" w:hAnsi="Segoe UI" w:cs="Segoe UI"/>
+          <w:spacing w:val="2"/>
+          <w:kern w:val="0"/>
+          <w:sz w:val="24"/>
+          <w:szCs w:val="24"/>
+          <w:lang w:eastAsia="es-MX"/>
+          <w14:ligatures w14:val="none"/>
+        </w:rPr>
+        <w:t>Sirve para ver </w:t>
+      </w:r>
+      <w:r>
+        <w:rPr>
+          <w:rFonts w:ascii="Segoe UI" w:eastAsia="Times New Roman" w:hAnsi="Segoe UI" w:cs="Segoe UI"/>
+          <w:b/>
+          <w:bCs/>
+          <w:spacing w:val="2"/>
+          <w:kern w:val="0"/>
+          <w:sz w:val="24"/>
+          <w:szCs w:val="24"/>
+          <w:bdr w:val="single" w:sz="2" w:space="0" w:color="auto" w:frame="1"/>
+          <w:lang w:eastAsia="es-MX"/>
+          <w14:ligatures w14:val="none"/>
+        </w:rPr>
+        <w:t>agrupamientos (clusters)</w:t>
+      </w:r>
+      <w:r>
+        <w:rPr>
+          <w:rFonts w:ascii="Segoe UI" w:eastAsia="Times New Roman" w:hAnsi="Segoe UI" w:cs="Segoe UI"/>
+          <w:spacing w:val="2"/>
+          <w:kern w:val="0"/>
+          <w:sz w:val="24"/>
+          <w:szCs w:val="24"/>
+          <w:lang w:eastAsia="es-MX"/>
+          <w14:ligatures w14:val="none"/>
+        </w:rPr>
+        <w:t>: ej. "Muestras sanas vs. Muestras enfermas" o "Polímero A vs. Polímero B".</w:t>
+      </w:r>
+    </w:p>
+    <w:p>
+      <w:pPr>
+        <w:numPr>
+          <w:ilvl w:val="0"/>
+          <w:numId w:val="6"/>
+        </w:numPr>
+        <w:pBdr>
+          <w:top w:val="single" w:sz="2" w:space="0" w:color="auto"/>
+          <w:left w:val="single" w:sz="2" w:space="0" w:color="auto"/>
+          <w:bottom w:val="single" w:sz="2" w:space="0" w:color="auto"/>
+          <w:right w:val="single" w:sz="2" w:space="0" w:color="auto"/>
+        </w:pBdr>
+        <w:spacing w:before="100" w:beforeAutospacing="1" w:after="100" w:afterAutospacing="1" w:line="240" w:lineRule="auto"/>
+        <w:rPr>
+          <w:rFonts w:ascii="Segoe UI" w:eastAsia="Times New Roman" w:hAnsi="Segoe UI" w:cs="Segoe UI"/>
+          <w:spacing w:val="2"/>
+          <w:kern w:val="0"/>
+          <w:sz w:val="24"/>
+          <w:szCs w:val="24"/>
+          <w:lang w:eastAsia="es-MX"/>
+          <w14:ligatures w14:val="none"/>
+        </w:rPr>
+      </w:pPr>
+      <w:r>
+        <w:rPr>
+          <w:rFonts w:ascii="Segoe UI" w:eastAsia="Times New Roman" w:hAnsi="Segoe UI" w:cs="Segoe UI"/>
+          <w:b/>
+          <w:bCs/>
+          <w:spacing w:val="2"/>
+          <w:kern w:val="0"/>
+          <w:sz w:val="24"/>
+          <w:szCs w:val="24"/>
+          <w:bdr w:val="single" w:sz="2" w:space="0" w:color="auto" w:frame="1"/>
+          <w:lang w:eastAsia="es-MX"/>
+          <w14:ligatures w14:val="none"/>
+        </w:rPr>
+        <w:t>Gráfico de Loadings (Cargas):</w:t>
+      </w:r>
+    </w:p>
+    <w:p>
+      <w:pPr>
+        <w:numPr>
+          <w:ilvl w:val="1"/>
+          <w:numId w:val="6"/>
+        </w:numPr>
+        <w:pBdr>
+          <w:top w:val="single" w:sz="2" w:space="0" w:color="auto"/>
+          <w:left w:val="single" w:sz="2" w:space="0" w:color="auto"/>
+          <w:bottom w:val="single" w:sz="2" w:space="0" w:color="auto"/>
+          <w:right w:val="single" w:sz="2" w:space="0" w:color="auto"/>
+        </w:pBdr>
+        <w:spacing w:before="100" w:beforeAutospacing="1" w:after="100" w:afterAutospacing="1" w:line="240" w:lineRule="auto"/>
+        <w:rPr>
+          <w:rFonts w:ascii="Segoe UI" w:eastAsia="Times New Roman" w:hAnsi="Segoe UI" w:cs="Segoe UI"/>
+          <w:spacing w:val="2"/>
+          <w:kern w:val="0"/>
+          <w:sz w:val="24"/>
+          <w:szCs w:val="24"/>
+          <w:lang w:eastAsia="es-MX"/>
+          <w14:ligatures w14:val="none"/>
+        </w:rPr>
+      </w:pPr>
+      <w:r>
+        <w:rPr>
+          <w:rFonts w:ascii="Segoe UI" w:eastAsia="Times New Roman" w:hAnsi="Segoe UI" w:cs="Segoe UI"/>
+          <w:spacing w:val="2"/>
+          <w:kern w:val="0"/>
+          <w:sz w:val="24"/>
+          <w:szCs w:val="24"/>
+          <w:lang w:eastAsia="es-MX"/>
+          <w14:ligatures w14:val="none"/>
+        </w:rPr>
+        <w:t>Representa a las </w:t>
+      </w:r>
+      <w:r>
+        <w:rPr>
+          <w:rFonts w:ascii="Segoe UI" w:eastAsia="Times New Roman" w:hAnsi="Segoe UI" w:cs="Segoe UI"/>
+          <w:b/>
+          <w:bCs/>
+          <w:spacing w:val="2"/>
+          <w:kern w:val="0"/>
+          <w:sz w:val="24"/>
+          <w:szCs w:val="24"/>
+          <w:bdr w:val="single" w:sz="2" w:space="0" w:color="auto" w:frame="1"/>
+          <w:lang w:eastAsia="es-MX"/>
+          <w14:ligatures w14:val="none"/>
+        </w:rPr>
+        <w:t>variables (números de onda)</w:t>
+      </w:r>
+      <w:r>
+        <w:rPr>
+          <w:rFonts w:ascii="Segoe UI" w:eastAsia="Times New Roman" w:hAnsi="Segoe UI" w:cs="Segoe UI"/>
+          <w:spacing w:val="2"/>
+          <w:kern w:val="0"/>
+          <w:sz w:val="24"/>
+          <w:szCs w:val="24"/>
+          <w:lang w:eastAsia="es-MX"/>
+          <w14:ligatures w14:val="none"/>
+        </w:rPr>
+        <w:t>.</w:t>
+      </w:r>
+    </w:p>
+    <w:p>
+      <w:pPr>
+        <w:numPr>
+          <w:ilvl w:val="1"/>
+          <w:numId w:val="6"/>
+        </w:numPr>
+        <w:pBdr>
+          <w:top w:val="single" w:sz="2" w:space="0" w:color="auto"/>
+          <w:left w:val="single" w:sz="2" w:space="0" w:color="auto"/>
+          <w:bottom w:val="single" w:sz="2" w:space="0" w:color="auto"/>
+          <w:right w:val="single" w:sz="2" w:space="0" w:color="auto"/>
+        </w:pBdr>
+        <w:spacing w:before="100" w:beforeAutospacing="1" w:after="100" w:afterAutospacing="1" w:line="240" w:lineRule="auto"/>
+        <w:rPr>
+          <w:rFonts w:ascii="Segoe UI" w:eastAsia="Times New Roman" w:hAnsi="Segoe UI" w:cs="Segoe UI"/>
+          <w:spacing w:val="2"/>
+          <w:kern w:val="0"/>
+          <w:sz w:val="24"/>
+          <w:szCs w:val="24"/>
+          <w:lang w:eastAsia="es-MX"/>
+          <w14:ligatures w14:val="none"/>
+        </w:rPr>
+      </w:pPr>
+      <w:r>
+        <w:rPr>
+          <w:rFonts w:ascii="Segoe UI" w:eastAsia="Times New Roman" w:hAnsi="Segoe UI" w:cs="Segoe UI"/>
+          <w:spacing w:val="2"/>
+          <w:kern w:val="0"/>
+          <w:sz w:val="24"/>
+          <w:szCs w:val="24"/>
+          <w:lang w:eastAsia="es-MX"/>
+          <w14:ligatures w14:val="none"/>
+        </w:rPr>
+        <w:t>Te dice </w:t>
+      </w:r>
+      <w:r>
+        <w:rPr>
+          <w:rFonts w:ascii="Segoe UI" w:eastAsia="Times New Roman" w:hAnsi="Segoe UI" w:cs="Segoe UI"/>
+          <w:i/>
+          <w:iCs/>
+          <w:spacing w:val="2"/>
+          <w:kern w:val="0"/>
+          <w:sz w:val="24"/>
+          <w:szCs w:val="24"/>
+          <w:bdr w:val="single" w:sz="2" w:space="0" w:color="auto" w:frame="1"/>
+          <w:lang w:eastAsia="es-MX"/>
+          <w14:ligatures w14:val="none"/>
+        </w:rPr>
+        <w:t>qué</w:t>
+      </w:r>
+      <w:r>
+        <w:rPr>
+          <w:rFonts w:ascii="Segoe UI" w:eastAsia="Times New Roman" w:hAnsi="Segoe UI" w:cs="Segoe UI"/>
+          <w:spacing w:val="2"/>
+          <w:kern w:val="0"/>
+          <w:sz w:val="24"/>
+          <w:szCs w:val="24"/>
+          <w:lang w:eastAsia="es-MX"/>
+          <w14:ligatures w14:val="none"/>
+        </w:rPr>
+        <w:t> picos del espectro son responsables de separar los grupos en los Scores.</w:t>
+      </w:r>
+    </w:p>
+    <w:p>
+      <w:pPr>
+        <w:numPr>
+          <w:ilvl w:val="1"/>
+          <w:numId w:val="6"/>
+        </w:numPr>
+        <w:pBdr>
+          <w:top w:val="single" w:sz="2" w:space="0" w:color="auto"/>
+          <w:left w:val="single" w:sz="2" w:space="0" w:color="auto"/>
+          <w:bottom w:val="single" w:sz="2" w:space="0" w:color="auto"/>
+          <w:right w:val="single" w:sz="2" w:space="0" w:color="auto"/>
+        </w:pBdr>
+        <w:spacing w:before="100" w:beforeAutospacing="1" w:after="100" w:afterAutospacing="1" w:line="240" w:lineRule="auto"/>
+        <w:rPr>
+          <w:rFonts w:ascii="Segoe UI" w:eastAsia="Times New Roman" w:hAnsi="Segoe UI" w:cs="Segoe UI"/>
+          <w:spacing w:val="2"/>
+          <w:kern w:val="0"/>
+          <w:sz w:val="24"/>
+          <w:szCs w:val="24"/>
+          <w:lang w:eastAsia="es-MX"/>
+          <w14:ligatures w14:val="none"/>
+        </w:rPr>
+      </w:pPr>
+      <w:r>
+        <w:rPr>
+          <w:rFonts w:ascii="Segoe UI" w:eastAsia="Times New Roman" w:hAnsi="Segoe UI" w:cs="Segoe UI"/>
+          <w:i/>
+          <w:iCs/>
+          <w:spacing w:val="2"/>
+          <w:kern w:val="0"/>
+          <w:sz w:val="24"/>
+          <w:szCs w:val="24"/>
+          <w:bdr w:val="single" w:sz="2" w:space="0" w:color="auto" w:frame="1"/>
+          <w:lang w:eastAsia="es-MX"/>
+          <w14:ligatures w14:val="none"/>
+        </w:rPr>
+        <w:t>Ejemplo:</w:t>
+      </w:r>
+      <w:r>
+        <w:rPr>
+          <w:rFonts w:ascii="Segoe UI" w:eastAsia="Times New Roman" w:hAnsi="Segoe UI" w:cs="Segoe UI"/>
+          <w:spacing w:val="2"/>
+          <w:kern w:val="0"/>
+          <w:sz w:val="24"/>
+          <w:szCs w:val="24"/>
+          <w:lang w:eastAsia="es-MX"/>
+          <w14:ligatures w14:val="none"/>
+        </w:rPr>
+        <w:t> "Si el grupo A está en la zona positiva del PC1, y en los Loadings hay un pico fuerte positivo en 1000 cm⁻¹, significa que el grupo A tiene más de esa sustancia que vibra a 1000 cm⁻¹."</w:t>
+      </w:r>
+    </w:p>
+    <w:p>
+      <w:pPr>
+        <w:spacing w:before="240" w:after="240" w:line="240" w:lineRule="auto"/>
+        <w:rPr>
+          <w:rFonts w:ascii="Segoe UI" w:eastAsia="Times New Roman" w:hAnsi="Segoe UI" w:cs="Segoe UI"/>
+          <w:spacing w:val="2"/>
+          <w:kern w:val="0"/>
+          <w:sz w:val="24"/>
+          <w:szCs w:val="24"/>
+          <w:lang w:eastAsia="es-MX"/>
+          <w14:ligatures w14:val="none"/>
+        </w:rPr>
+      </w:pPr>
+      <w:r>
+        <w:rPr>
+          <w:rFonts w:ascii="Times New Roman" w:eastAsia="Times New Roman" w:hAnsi="Times New Roman" w:cs="Times New Roman"/>
+          <w:kern w:val="0"/>
+          <w:sz w:val="24"/>
+          <w:szCs w:val="24"/>
+          <w:lang w:eastAsia="es-MX"/>
+          <w14:ligatures w14:val="none"/>
+        </w:rPr>
+        <w:pict w14:anchorId="05014DAC">
+          <v:rect id="_x0000_i1034" style="width:0;height:.75pt" o:hralign="center" o:hrstd="t" o:hr="t" fillcolor="#a0a0a0" stroked="f"/>
+        </w:pict>
+      </w:r>
+    </w:p>
+    <w:p>
+      <w:pPr>
+        <w:pBdr>
+          <w:top w:val="single" w:sz="2" w:space="0" w:color="auto"/>
+          <w:left w:val="single" w:sz="2" w:space="0" w:color="auto"/>
+          <w:bottom w:val="single" w:sz="2" w:space="0" w:color="auto"/>
+          <w:right w:val="single" w:sz="2" w:space="0" w:color="auto"/>
+        </w:pBdr>
+        <w:spacing w:before="100" w:beforeAutospacing="1" w:after="100" w:afterAutospacing="1" w:line="240" w:lineRule="auto"/>
+        <w:outlineLvl w:val="1"/>
+        <w:rPr>
+          <w:rFonts w:ascii="Segoe UI" w:eastAsia="Times New Roman" w:hAnsi="Segoe UI" w:cs="Segoe UI"/>
+          <w:b/>
+          <w:bCs/>
+          <w:spacing w:val="2"/>
+          <w:kern w:val="0"/>
+          <w:sz w:val="36"/>
+          <w:szCs w:val="36"/>
+          <w:lang w:eastAsia="es-MX"/>
+          <w14:ligatures w14:val="none"/>
+        </w:rPr>
+      </w:pPr>
+      <w:r>
+        <w:rPr>
+          <w:rFonts w:ascii="Segoe UI" w:eastAsia="Times New Roman" w:hAnsi="Segoe UI" w:cs="Segoe UI"/>
+          <w:b/>
+          <w:bCs/>
+          <w:spacing w:val="2"/>
+          <w:kern w:val="0"/>
+          <w:sz w:val="36"/>
+          <w:szCs w:val="36"/>
+          <w:lang w:eastAsia="es-MX"/>
+          <w14:ligatures w14:val="none"/>
+        </w:rPr>
+        <w:t>Resumen del Esquema Sugerido (Índice Tentativo)</w:t>
+      </w:r>
+    </w:p>
+    <w:p>
+      <w:pPr>
+        <w:numPr>
+          <w:ilvl w:val="0"/>
+          <w:numId w:val="7"/>
+        </w:numPr>
+        <w:pBdr>
+          <w:top w:val="single" w:sz="2" w:space="0" w:color="auto"/>
+          <w:left w:val="single" w:sz="2" w:space="0" w:color="auto"/>
+          <w:bottom w:val="single" w:sz="2" w:space="0" w:color="auto"/>
+          <w:right w:val="single" w:sz="2" w:space="0" w:color="auto"/>
+        </w:pBdr>
+        <w:spacing w:before="100" w:beforeAutospacing="1" w:after="100" w:afterAutospacing="1" w:line="240" w:lineRule="auto"/>
+        <w:rPr>
+          <w:rFonts w:ascii="Segoe UI" w:eastAsia="Times New Roman" w:hAnsi="Segoe UI" w:cs="Segoe UI"/>
+          <w:spacing w:val="2"/>
+          <w:kern w:val="0"/>
+          <w:sz w:val="24"/>
+          <w:szCs w:val="24"/>
+          <w:lang w:eastAsia="es-MX"/>
+          <w14:ligatures w14:val="none"/>
+        </w:rPr>
+      </w:pPr>
+      <w:r>
+        <w:rPr>
+          <w:rFonts w:ascii="Segoe UI" w:eastAsia="Times New Roman" w:hAnsi="Segoe UI" w:cs="Segoe UI"/>
+          <w:b/>
+          <w:bCs/>
+          <w:spacing w:val="2"/>
+          <w:kern w:val="0"/>
+          <w:sz w:val="24"/>
+          <w:szCs w:val="24"/>
+          <w:bdr w:val="single" w:sz="2" w:space="0" w:color="auto" w:frame="1"/>
+          <w:lang w:eastAsia="es-MX"/>
+          <w14:ligatures w14:val="none"/>
+        </w:rPr>
+        <w:t>Naturaleza Multivariante de los Espectros Vibracionales:</w:t>
+      </w:r>
+      <w:r>
+        <w:rPr>
+          <w:rFonts w:ascii="Segoe UI" w:eastAsia="Times New Roman" w:hAnsi="Segoe UI" w:cs="Segoe UI"/>
+          <w:spacing w:val="2"/>
+          <w:kern w:val="0"/>
+          <w:sz w:val="24"/>
+          <w:szCs w:val="24"/>
+          <w:lang w:eastAsia="es-MX"/>
+          <w14:ligatures w14:val="none"/>
+        </w:rPr>
+        <w:t> Desafíos en el análisis de grandes sets de datos Raman/FTIR.</w:t>
+      </w:r>
+    </w:p>
+    <w:p>
+      <w:pPr>
+        <w:numPr>
+          <w:ilvl w:val="0"/>
+          <w:numId w:val="7"/>
+        </w:numPr>
+        <w:pBdr>
+          <w:top w:val="single" w:sz="2" w:space="0" w:color="auto"/>
+          <w:left w:val="single" w:sz="2" w:space="0" w:color="auto"/>
+          <w:bottom w:val="single" w:sz="2" w:space="0" w:color="auto"/>
+          <w:right w:val="single" w:sz="2" w:space="0" w:color="auto"/>
+        </w:pBdr>
+        <w:spacing w:before="100" w:beforeAutospacing="1" w:after="100" w:afterAutospacing="1" w:line="240" w:lineRule="auto"/>
+        <w:rPr>
+          <w:rFonts w:ascii="Segoe UI" w:eastAsia="Times New Roman" w:hAnsi="Segoe UI" w:cs="Segoe UI"/>
+          <w:spacing w:val="2"/>
+          <w:kern w:val="0"/>
+          <w:sz w:val="24"/>
+          <w:szCs w:val="24"/>
+          <w:lang w:eastAsia="es-MX"/>
+          <w14:ligatures w14:val="none"/>
+        </w:rPr>
+      </w:pPr>
+      <w:r>
+        <w:rPr>
+          <w:rFonts w:ascii="Segoe UI" w:eastAsia="Times New Roman" w:hAnsi="Segoe UI" w:cs="Segoe UI"/>
+          <w:b/>
+          <w:bCs/>
+          <w:spacing w:val="2"/>
+          <w:kern w:val="0"/>
+          <w:sz w:val="24"/>
+          <w:szCs w:val="24"/>
+          <w:bdr w:val="single" w:sz="2" w:space="0" w:color="auto" w:frame="1"/>
+          <w:lang w:eastAsia="es-MX"/>
+          <w14:ligatures w14:val="none"/>
+        </w:rPr>
+        <w:t>Tratamiento Matemático Previo (Pre-procesamiento):</w:t>
+      </w:r>
+      <w:r>
+        <w:rPr>
+          <w:rFonts w:ascii="Segoe UI" w:eastAsia="Times New Roman" w:hAnsi="Segoe UI" w:cs="Segoe UI"/>
+          <w:spacing w:val="2"/>
+          <w:kern w:val="0"/>
+          <w:sz w:val="24"/>
+          <w:szCs w:val="24"/>
+          <w:lang w:eastAsia="es-MX"/>
+          <w14:ligatures w14:val="none"/>
+        </w:rPr>
+        <w:t> Corrección de línea base, normalización y derivadas.</w:t>
+      </w:r>
+    </w:p>
+    <w:p>
+      <w:pPr>
+        <w:numPr>
+          <w:ilvl w:val="0"/>
+          <w:numId w:val="7"/>
+        </w:numPr>
+        <w:pBdr>
+          <w:top w:val="single" w:sz="2" w:space="0" w:color="auto"/>
+          <w:left w:val="single" w:sz="2" w:space="0" w:color="auto"/>
+          <w:bottom w:val="single" w:sz="2" w:space="0" w:color="auto"/>
+          <w:right w:val="single" w:sz="2" w:space="0" w:color="auto"/>
+        </w:pBdr>
+        <w:spacing w:before="100" w:beforeAutospacing="1" w:after="100" w:afterAutospacing="1" w:line="240" w:lineRule="auto"/>
+        <w:rPr>
+          <w:rFonts w:ascii="Segoe UI" w:eastAsia="Times New Roman" w:hAnsi="Segoe UI" w:cs="Segoe UI"/>
+          <w:spacing w:val="2"/>
+          <w:kern w:val="0"/>
+          <w:sz w:val="24"/>
+          <w:szCs w:val="24"/>
+          <w:lang w:eastAsia="es-MX"/>
+          <w14:ligatures w14:val="none"/>
+        </w:rPr>
+      </w:pPr>
+      <w:r>
+        <w:rPr>
+          <w:rFonts w:ascii="Segoe UI" w:eastAsia="Times New Roman" w:hAnsi="Segoe UI" w:cs="Segoe UI"/>
+          <w:b/>
+          <w:bCs/>
+          <w:spacing w:val="2"/>
+          <w:kern w:val="0"/>
+          <w:sz w:val="24"/>
+          <w:szCs w:val="24"/>
+          <w:bdr w:val="single" w:sz="2" w:space="0" w:color="auto" w:frame="1"/>
+          <w:lang w:eastAsia="es-MX"/>
+          <w14:ligatures w14:val="none"/>
+        </w:rPr>
+        <w:t>Fundamentos del Análisis de Componentes Principales (PCA):</w:t>
+      </w:r>
+    </w:p>
+    <w:p>
+      <w:pPr>
+        <w:numPr>
+          <w:ilvl w:val="1"/>
+          <w:numId w:val="7"/>
+        </w:numPr>
+        <w:pBdr>
+          <w:top w:val="single" w:sz="2" w:space="0" w:color="auto"/>
+          <w:left w:val="single" w:sz="2" w:space="0" w:color="auto"/>
+          <w:bottom w:val="single" w:sz="2" w:space="0" w:color="auto"/>
+          <w:right w:val="single" w:sz="2" w:space="0" w:color="auto"/>
+        </w:pBdr>
+        <w:spacing w:before="100" w:beforeAutospacing="1" w:after="100" w:afterAutospacing="1" w:line="240" w:lineRule="auto"/>
+        <w:rPr>
+          <w:rFonts w:ascii="Segoe UI" w:eastAsia="Times New Roman" w:hAnsi="Segoe UI" w:cs="Segoe UI"/>
+          <w:spacing w:val="2"/>
+          <w:kern w:val="0"/>
+          <w:sz w:val="24"/>
+          <w:szCs w:val="24"/>
+          <w:lang w:eastAsia="es-MX"/>
+          <w14:ligatures w14:val="none"/>
+        </w:rPr>
+      </w:pPr>
+      <w:r>
+        <w:rPr>
+          <w:rFonts w:ascii="Segoe UI" w:eastAsia="Times New Roman" w:hAnsi="Segoe UI" w:cs="Segoe UI"/>
+          <w:spacing w:val="2"/>
+          <w:kern w:val="0"/>
+          <w:sz w:val="24"/>
+          <w:szCs w:val="24"/>
+          <w:lang w:eastAsia="es-MX"/>
+          <w14:ligatures w14:val="none"/>
+        </w:rPr>
+        <w:t>Reducción de dimensionalidad y varianza explicada.</w:t>
+      </w:r>
+    </w:p>
+    <w:p>
+      <w:pPr>
+        <w:numPr>
+          <w:ilvl w:val="1"/>
+          <w:numId w:val="7"/>
+        </w:numPr>
+        <w:pBdr>
+          <w:top w:val="single" w:sz="2" w:space="0" w:color="auto"/>
+          <w:left w:val="single" w:sz="2" w:space="0" w:color="auto"/>
+          <w:bottom w:val="single" w:sz="2" w:space="0" w:color="auto"/>
+          <w:right w:val="single" w:sz="2" w:space="0" w:color="auto"/>
+        </w:pBdr>
+        <w:spacing w:before="100" w:beforeAutospacing="1" w:after="100" w:afterAutospacing="1" w:line="240" w:lineRule="auto"/>
+        <w:rPr>
+          <w:rFonts w:ascii="Segoe UI" w:eastAsia="Times New Roman" w:hAnsi="Segoe UI" w:cs="Segoe UI"/>
+          <w:spacing w:val="2"/>
+          <w:kern w:val="0"/>
+          <w:sz w:val="24"/>
+          <w:szCs w:val="24"/>
+          <w:lang w:eastAsia="es-MX"/>
+          <w14:ligatures w14:val="none"/>
+        </w:rPr>
+      </w:pPr>
+      <w:r>
+        <w:rPr>
+          <w:rFonts w:ascii="Segoe UI" w:eastAsia="Times New Roman" w:hAnsi="Segoe UI" w:cs="Segoe UI"/>
+          <w:spacing w:val="2"/>
+          <w:kern w:val="0"/>
+          <w:sz w:val="24"/>
+          <w:szCs w:val="24"/>
+          <w:lang w:eastAsia="es-MX"/>
+          <w14:ligatures w14:val="none"/>
+        </w:rPr>
+        <w:t>Descomposición matricial (opcional, si quieres ser más técnico).</w:t>
+      </w:r>
+    </w:p>
+    <w:p>
+      <w:pPr>
+        <w:numPr>
+          <w:ilvl w:val="0"/>
+          <w:numId w:val="7"/>
+        </w:numPr>
+        <w:pBdr>
+          <w:top w:val="single" w:sz="2" w:space="0" w:color="auto"/>
+          <w:left w:val="single" w:sz="2" w:space="0" w:color="auto"/>
+          <w:bottom w:val="single" w:sz="2" w:space="0" w:color="auto"/>
+          <w:right w:val="single" w:sz="2" w:space="0" w:color="auto"/>
+        </w:pBdr>
+        <w:spacing w:before="100" w:beforeAutospacing="1" w:after="100" w:afterAutospacing="1" w:line="240" w:lineRule="auto"/>
+        <w:rPr>
+          <w:rFonts w:ascii="Segoe UI" w:eastAsia="Times New Roman" w:hAnsi="Segoe UI" w:cs="Segoe UI"/>
+          <w:spacing w:val="2"/>
+          <w:kern w:val="0"/>
+          <w:sz w:val="24"/>
+          <w:szCs w:val="24"/>
+          <w:lang w:eastAsia="es-MX"/>
+          <w14:ligatures w14:val="none"/>
+        </w:rPr>
+      </w:pPr>
+      <w:r>
+        <w:rPr>
+          <w:rFonts w:ascii="Segoe UI" w:eastAsia="Times New Roman" w:hAnsi="Segoe UI" w:cs="Segoe UI"/>
+          <w:b/>
+          <w:bCs/>
+          <w:spacing w:val="2"/>
+          <w:kern w:val="0"/>
+          <w:sz w:val="24"/>
+          <w:szCs w:val="24"/>
+          <w:bdr w:val="single" w:sz="2" w:space="0" w:color="auto" w:frame="1"/>
+          <w:lang w:eastAsia="es-MX"/>
+          <w14:ligatures w14:val="none"/>
+        </w:rPr>
+        <w:t>Interpretación en Quimiometría:</w:t>
+      </w:r>
+    </w:p>
+    <w:p>
+      <w:pPr>
+        <w:numPr>
+          <w:ilvl w:val="1"/>
+          <w:numId w:val="7"/>
+        </w:numPr>
+        <w:pBdr>
+          <w:top w:val="single" w:sz="2" w:space="0" w:color="auto"/>
+          <w:left w:val="single" w:sz="2" w:space="0" w:color="auto"/>
+          <w:bottom w:val="single" w:sz="2" w:space="0" w:color="auto"/>
+          <w:right w:val="single" w:sz="2" w:space="0" w:color="auto"/>
+        </w:pBdr>
+        <w:spacing w:before="100" w:beforeAutospacing="1" w:after="100" w:afterAutospacing="1" w:line="240" w:lineRule="auto"/>
+        <w:rPr>
+          <w:rFonts w:ascii="Segoe UI" w:eastAsia="Times New Roman" w:hAnsi="Segoe UI" w:cs="Segoe UI"/>
+          <w:spacing w:val="2"/>
+          <w:kern w:val="0"/>
+          <w:sz w:val="24"/>
+          <w:szCs w:val="24"/>
+          <w:lang w:eastAsia="es-MX"/>
+          <w14:ligatures w14:val="none"/>
+        </w:rPr>
+      </w:pPr>
+      <w:r>
+        <w:rPr>
+          <w:rFonts w:ascii="Segoe UI" w:eastAsia="Times New Roman" w:hAnsi="Segoe UI" w:cs="Segoe UI"/>
+          <w:spacing w:val="2"/>
+          <w:kern w:val="0"/>
+          <w:sz w:val="24"/>
+          <w:szCs w:val="24"/>
+          <w:lang w:eastAsia="es-MX"/>
+          <w14:ligatures w14:val="none"/>
+        </w:rPr>
+        <w:t>Mapas de puntuaciones (Scores plots): Identificación de patrones.</w:t>
+      </w:r>
+    </w:p>
+    <w:p>
+      <w:pPr>
+        <w:numPr>
+          <w:ilvl w:val="1"/>
+          <w:numId w:val="7"/>
+        </w:numPr>
+        <w:pBdr>
+          <w:top w:val="single" w:sz="2" w:space="0" w:color="auto"/>
+          <w:left w:val="single" w:sz="2" w:space="0" w:color="auto"/>
+          <w:bottom w:val="single" w:sz="2" w:space="0" w:color="auto"/>
+          <w:right w:val="single" w:sz="2" w:space="0" w:color="auto"/>
+        </w:pBdr>
+        <w:spacing w:before="100" w:beforeAutospacing="1" w:after="100" w:afterAutospacing="1" w:line="240" w:lineRule="auto"/>
+        <w:rPr>
+          <w:rFonts w:ascii="Segoe UI" w:eastAsia="Times New Roman" w:hAnsi="Segoe UI" w:cs="Segoe UI"/>
+          <w:spacing w:val="2"/>
+          <w:kern w:val="0"/>
+          <w:sz w:val="24"/>
+          <w:szCs w:val="24"/>
+          <w:lang w:eastAsia="es-MX"/>
+          <w14:ligatures w14:val="none"/>
+        </w:rPr>
+      </w:pPr>
+      <w:r>
+        <w:rPr>
+          <w:rFonts w:ascii="Segoe UI" w:eastAsia="Times New Roman" w:hAnsi="Segoe UI" w:cs="Segoe UI"/>
+          <w:spacing w:val="2"/>
+          <w:kern w:val="0"/>
+          <w:sz w:val="24"/>
+          <w:szCs w:val="24"/>
+          <w:lang w:eastAsia="es-MX"/>
+          <w14:ligatures w14:val="none"/>
+        </w:rPr>
+        <w:t>Vectores de carga (Loadings plots): Asignación de bandas espectrales.</w:t>
       </w:r>
     </w:p>
     <w:p>
@@ -2499,8 +4072,157 @@
 </file>
 
 <file path=word/numbering.xml><?xml version="1.0" encoding="utf-8"?>
-<w:numbering xmlns:wpc="http://schemas.microsoft.com/office/word/2010/wordprocessingCanvas" xmlns:cx="http://schemas.microsoft.com/office/drawing/2014/chartex" xmlns:cx1="http://schemas.microsoft.com/office/drawing/2015/9/8/chartex" xmlns:cx2="http://schemas.microsoft.com/office/drawing/2015/10/21/chartex" xmlns:cx3="http://schemas.microsoft.com/office/drawing/2016/5/9/chartex" xmlns:cx4="http://schemas.microsoft.com/office/drawing/2016/5/10/chartex" xmlns:cx5="http://schemas.microsoft.com/office/drawing/2016/5/11/chartex" xmlns:cx6="http://schemas.microsoft.com/office/drawing/2016/5/12/chartex" xmlns:cx7="http://schemas.microsoft.com/office/drawing/2016/5/13/chartex" xmlns:cx8="http://schemas.microsoft.com/office/drawing/2016/5/14/chartex" xmlns:mc="http://schemas.openxmlformats.org/markup-compatibility/2006" xmlns:aink="http://schemas.microsoft.com/office/drawing/2016/ink" xmlns:am3d="http://schemas.microsoft.com/office/drawing/2017/model3d" xmlns:o="urn:schemas-microsoft-com:office:office" xmlns:oel="http://schemas.microsoft.com/office/2019/extlst" xmlns:r="http://schemas.openxmlformats.org/officeDocument/2006/relationships" xmlns:m="http://schemas.openxmlformats.org/officeDocument/2006/math" xmlns:v="urn:schemas-microsoft-com:vml" xmlns:wp14="http://schemas.microsoft.com/office/word/2010/wordprocessingDrawing" xmlns:wp="http://schemas.openxmlformats.org/drawingml/2006/wordprocessingDrawing" xmlns:w10="urn:schemas-microsoft-com:office:word" xmlns:w="http://schemas.openxmlformats.org/wordprocessingml/2006/main" xmlns:w14="http://schemas.microsoft.com/office/word/2010/wordml" xmlns:w15="http://schemas.microsoft.com/office/word/2012/wordml" xmlns:w16cex="http://schemas.microsoft.com/office/word/2018/wordml/cex" xmlns:w16cid="http://schemas.microsoft.com/office/word/2016/wordml/cid" xmlns:w16="http://schemas.microsoft.com/office/word/2018/wordml" xmlns:w16sdtdh="http://schemas.microsoft.com/office/word/2020/wordml/sdtdatahash" xmlns:w16se="http://schemas.microsoft.com/office/word/2015/wordml/symex" xmlns:wpg="http://schemas.microsoft.com/office/word/2010/wordprocessingGroup" xmlns:wpi="http://schemas.microsoft.com/office/word/2010/wordprocessingInk" xmlns:wne="http://schemas.microsoft.com/office/word/2006/wordml" xmlns:wps="http://schemas.microsoft.com/office/word/2010/wordprocessingShape" mc:Ignorable="w14 w15 w16se w16cid w16 w16cex w16sdtdh wp14">
+<w:numbering xmlns:wpc="http://schemas.microsoft.com/office/word/2010/wordprocessingCanvas" xmlns:cx="http://schemas.microsoft.com/office/drawing/2014/chartex" xmlns:cx1="http://schemas.microsoft.com/office/drawing/2015/9/8/chartex" xmlns:cx2="http://schemas.microsoft.com/office/drawing/2015/10/21/chartex" xmlns:cx3="http://schemas.microsoft.com/office/drawing/2016/5/9/chartex" xmlns:cx4="http://schemas.microsoft.com/office/drawing/2016/5/10/chartex" xmlns:cx5="http://schemas.microsoft.com/office/drawing/2016/5/11/chartex" xmlns:cx6="http://schemas.microsoft.com/office/drawing/2016/5/12/chartex" xmlns:cx7="http://schemas.microsoft.com/office/drawing/2016/5/13/chartex" xmlns:cx8="http://schemas.microsoft.com/office/drawing/2016/5/14/chartex" xmlns:mc="http://schemas.openxmlformats.org/markup-compatibility/2006" xmlns:aink="http://schemas.microsoft.com/office/drawing/2016/ink" xmlns:am3d="http://schemas.microsoft.com/office/drawing/2017/model3d" xmlns:o="urn:schemas-microsoft-com:office:office" xmlns:oel="http://schemas.microsoft.com/office/2019/extlst" xmlns:r="http://schemas.openxmlformats.org/officeDocument/2006/relationships" xmlns:m="http://schemas.openxmlformats.org/officeDocument/2006/math" xmlns:v="urn:schemas-microsoft-com:vml" xmlns:wp14="http://schemas.microsoft.com/office/word/2010/wordprocessingDrawing" xmlns:wp="http://schemas.openxmlformats.org/drawingml/2006/wordprocessingDrawing" xmlns:w10="urn:schemas-microsoft-com:office:word" xmlns:w="http://schemas.openxmlformats.org/wordprocessingml/2006/main" xmlns:w14="http://schemas.microsoft.com/office/word/2010/wordml" xmlns:w15="http://schemas.microsoft.com/office/word/2012/wordml" xmlns:w16cex="http://schemas.microsoft.com/office/word/2018/wordml/cex" xmlns:w16cid="http://schemas.microsoft.com/office/word/2016/wordml/cid" xmlns:w16="http://schemas.microsoft.com/office/word/2018/wordml" xmlns:w16du="http://schemas.microsoft.com/office/word/2023/wordml/word16du" xmlns:w16sdtdh="http://schemas.microsoft.com/office/word/2020/wordml/sdtdatahash" xmlns:w16se="http://schemas.microsoft.com/office/word/2015/wordml/symex" xmlns:wpg="http://schemas.microsoft.com/office/word/2010/wordprocessingGroup" xmlns:wpi="http://schemas.microsoft.com/office/word/2010/wordprocessingInk" xmlns:wne="http://schemas.microsoft.com/office/word/2006/wordml" xmlns:wps="http://schemas.microsoft.com/office/word/2010/wordprocessingShape" mc:Ignorable="w14 w15 w16se w16cid w16 w16cex w16sdtdh w16du wp14">
   <w:abstractNum w:abstractNumId="0" w15:restartNumberingAfterBreak="0">
+    <w:nsid w:val="0D49664F"/>
+    <w:multiLevelType w:val="multilevel"/>
+    <w:tmpl w:val="5032E11A"/>
+    <w:lvl w:ilvl="0">
+      <w:start w:val="1"/>
+      <w:numFmt w:val="bullet"/>
+      <w:lvlText w:val=""/>
+      <w:lvlJc w:val="left"/>
+      <w:pPr>
+        <w:tabs>
+          <w:tab w:val="num" w:pos="720"/>
+        </w:tabs>
+        <w:ind w:left="720" w:hanging="360"/>
+      </w:pPr>
+      <w:rPr>
+        <w:rFonts w:ascii="Symbol" w:hAnsi="Symbol" w:hint="default"/>
+        <w:sz w:val="20"/>
+      </w:rPr>
+    </w:lvl>
+    <w:lvl w:ilvl="1">
+      <w:start w:val="1"/>
+      <w:numFmt w:val="bullet"/>
+      <w:lvlText w:val=""/>
+      <w:lvlJc w:val="left"/>
+      <w:pPr>
+        <w:tabs>
+          <w:tab w:val="num" w:pos="1440"/>
+        </w:tabs>
+        <w:ind w:left="1440" w:hanging="360"/>
+      </w:pPr>
+      <w:rPr>
+        <w:rFonts w:ascii="Symbol" w:hAnsi="Symbol" w:hint="default"/>
+        <w:sz w:val="20"/>
+      </w:rPr>
+    </w:lvl>
+    <w:lvl w:ilvl="2" w:tentative="1">
+      <w:start w:val="1"/>
+      <w:numFmt w:val="bullet"/>
+      <w:lvlText w:val=""/>
+      <w:lvlJc w:val="left"/>
+      <w:pPr>
+        <w:tabs>
+          <w:tab w:val="num" w:pos="2160"/>
+        </w:tabs>
+        <w:ind w:left="2160" w:hanging="360"/>
+      </w:pPr>
+      <w:rPr>
+        <w:rFonts w:ascii="Symbol" w:hAnsi="Symbol" w:hint="default"/>
+        <w:sz w:val="20"/>
+      </w:rPr>
+    </w:lvl>
+    <w:lvl w:ilvl="3" w:tentative="1">
+      <w:start w:val="1"/>
+      <w:numFmt w:val="bullet"/>
+      <w:lvlText w:val=""/>
+      <w:lvlJc w:val="left"/>
+      <w:pPr>
+        <w:tabs>
+          <w:tab w:val="num" w:pos="2880"/>
+        </w:tabs>
+        <w:ind w:left="2880" w:hanging="360"/>
+      </w:pPr>
+      <w:rPr>
+        <w:rFonts w:ascii="Symbol" w:hAnsi="Symbol" w:hint="default"/>
+        <w:sz w:val="20"/>
+      </w:rPr>
+    </w:lvl>
+    <w:lvl w:ilvl="4" w:tentative="1">
+      <w:start w:val="1"/>
+      <w:numFmt w:val="bullet"/>
+      <w:lvlText w:val=""/>
+      <w:lvlJc w:val="left"/>
+      <w:pPr>
+        <w:tabs>
+          <w:tab w:val="num" w:pos="3600"/>
+        </w:tabs>
+        <w:ind w:left="3600" w:hanging="360"/>
+      </w:pPr>
+      <w:rPr>
+        <w:rFonts w:ascii="Symbol" w:hAnsi="Symbol" w:hint="default"/>
+        <w:sz w:val="20"/>
+      </w:rPr>
+    </w:lvl>
+    <w:lvl w:ilvl="5" w:tentative="1">
+      <w:start w:val="1"/>
+      <w:numFmt w:val="bullet"/>
+      <w:lvlText w:val=""/>
+      <w:lvlJc w:val="left"/>
+      <w:pPr>
+        <w:tabs>
+          <w:tab w:val="num" w:pos="4320"/>
+        </w:tabs>
+        <w:ind w:left="4320" w:hanging="360"/>
+      </w:pPr>
+      <w:rPr>
+        <w:rFonts w:ascii="Symbol" w:hAnsi="Symbol" w:hint="default"/>
+        <w:sz w:val="20"/>
+      </w:rPr>
+    </w:lvl>
+    <w:lvl w:ilvl="6" w:tentative="1">
+      <w:start w:val="1"/>
+      <w:numFmt w:val="bullet"/>
+      <w:lvlText w:val=""/>
+      <w:lvlJc w:val="left"/>
+      <w:pPr>
+        <w:tabs>
+          <w:tab w:val="num" w:pos="5040"/>
+        </w:tabs>
+        <w:ind w:left="5040" w:hanging="360"/>
+      </w:pPr>
+      <w:rPr>
+        <w:rFonts w:ascii="Symbol" w:hAnsi="Symbol" w:hint="default"/>
+        <w:sz w:val="20"/>
+      </w:rPr>
+    </w:lvl>
+    <w:lvl w:ilvl="7" w:tentative="1">
+      <w:start w:val="1"/>
+      <w:numFmt w:val="bullet"/>
+      <w:lvlText w:val=""/>
+      <w:lvlJc w:val="left"/>
+      <w:pPr>
+        <w:tabs>
+          <w:tab w:val="num" w:pos="5760"/>
+        </w:tabs>
+        <w:ind w:left="5760" w:hanging="360"/>
+      </w:pPr>
+      <w:rPr>
+        <w:rFonts w:ascii="Symbol" w:hAnsi="Symbol" w:hint="default"/>
+        <w:sz w:val="20"/>
+      </w:rPr>
+    </w:lvl>
+    <w:lvl w:ilvl="8" w:tentative="1">
+      <w:start w:val="1"/>
+      <w:numFmt w:val="bullet"/>
+      <w:lvlText w:val=""/>
+      <w:lvlJc w:val="left"/>
+      <w:pPr>
+        <w:tabs>
+          <w:tab w:val="num" w:pos="6480"/>
+        </w:tabs>
+        <w:ind w:left="6480" w:hanging="360"/>
+      </w:pPr>
+      <w:rPr>
+        <w:rFonts w:ascii="Symbol" w:hAnsi="Symbol" w:hint="default"/>
+        <w:sz w:val="20"/>
+      </w:rPr>
+    </w:lvl>
+  </w:abstractNum>
+  <w:abstractNum w:abstractNumId="1" w15:restartNumberingAfterBreak="0">
     <w:nsid w:val="214471E1"/>
     <w:multiLevelType w:val="multilevel"/>
     <w:tmpl w:val="3DD47060"/>
@@ -2649,14 +4371,745 @@
       </w:rPr>
     </w:lvl>
   </w:abstractNum>
+  <w:abstractNum w:abstractNumId="2" w15:restartNumberingAfterBreak="0">
+    <w:nsid w:val="28410155"/>
+    <w:multiLevelType w:val="multilevel"/>
+    <w:tmpl w:val="74B842D8"/>
+    <w:lvl w:ilvl="0">
+      <w:start w:val="1"/>
+      <w:numFmt w:val="bullet"/>
+      <w:lvlText w:val=""/>
+      <w:lvlJc w:val="left"/>
+      <w:pPr>
+        <w:tabs>
+          <w:tab w:val="num" w:pos="720"/>
+        </w:tabs>
+        <w:ind w:left="720" w:hanging="360"/>
+      </w:pPr>
+      <w:rPr>
+        <w:rFonts w:ascii="Symbol" w:hAnsi="Symbol" w:hint="default"/>
+        <w:sz w:val="20"/>
+      </w:rPr>
+    </w:lvl>
+    <w:lvl w:ilvl="1">
+      <w:start w:val="1"/>
+      <w:numFmt w:val="bullet"/>
+      <w:lvlText w:val=""/>
+      <w:lvlJc w:val="left"/>
+      <w:pPr>
+        <w:tabs>
+          <w:tab w:val="num" w:pos="1440"/>
+        </w:tabs>
+        <w:ind w:left="1440" w:hanging="360"/>
+      </w:pPr>
+      <w:rPr>
+        <w:rFonts w:ascii="Symbol" w:hAnsi="Symbol" w:hint="default"/>
+        <w:sz w:val="20"/>
+      </w:rPr>
+    </w:lvl>
+    <w:lvl w:ilvl="2" w:tentative="1">
+      <w:start w:val="1"/>
+      <w:numFmt w:val="bullet"/>
+      <w:lvlText w:val=""/>
+      <w:lvlJc w:val="left"/>
+      <w:pPr>
+        <w:tabs>
+          <w:tab w:val="num" w:pos="2160"/>
+        </w:tabs>
+        <w:ind w:left="2160" w:hanging="360"/>
+      </w:pPr>
+      <w:rPr>
+        <w:rFonts w:ascii="Symbol" w:hAnsi="Symbol" w:hint="default"/>
+        <w:sz w:val="20"/>
+      </w:rPr>
+    </w:lvl>
+    <w:lvl w:ilvl="3" w:tentative="1">
+      <w:start w:val="1"/>
+      <w:numFmt w:val="bullet"/>
+      <w:lvlText w:val=""/>
+      <w:lvlJc w:val="left"/>
+      <w:pPr>
+        <w:tabs>
+          <w:tab w:val="num" w:pos="2880"/>
+        </w:tabs>
+        <w:ind w:left="2880" w:hanging="360"/>
+      </w:pPr>
+      <w:rPr>
+        <w:rFonts w:ascii="Symbol" w:hAnsi="Symbol" w:hint="default"/>
+        <w:sz w:val="20"/>
+      </w:rPr>
+    </w:lvl>
+    <w:lvl w:ilvl="4" w:tentative="1">
+      <w:start w:val="1"/>
+      <w:numFmt w:val="bullet"/>
+      <w:lvlText w:val=""/>
+      <w:lvlJc w:val="left"/>
+      <w:pPr>
+        <w:tabs>
+          <w:tab w:val="num" w:pos="3600"/>
+        </w:tabs>
+        <w:ind w:left="3600" w:hanging="360"/>
+      </w:pPr>
+      <w:rPr>
+        <w:rFonts w:ascii="Symbol" w:hAnsi="Symbol" w:hint="default"/>
+        <w:sz w:val="20"/>
+      </w:rPr>
+    </w:lvl>
+    <w:lvl w:ilvl="5" w:tentative="1">
+      <w:start w:val="1"/>
+      <w:numFmt w:val="bullet"/>
+      <w:lvlText w:val=""/>
+      <w:lvlJc w:val="left"/>
+      <w:pPr>
+        <w:tabs>
+          <w:tab w:val="num" w:pos="4320"/>
+        </w:tabs>
+        <w:ind w:left="4320" w:hanging="360"/>
+      </w:pPr>
+      <w:rPr>
+        <w:rFonts w:ascii="Symbol" w:hAnsi="Symbol" w:hint="default"/>
+        <w:sz w:val="20"/>
+      </w:rPr>
+    </w:lvl>
+    <w:lvl w:ilvl="6" w:tentative="1">
+      <w:start w:val="1"/>
+      <w:numFmt w:val="bullet"/>
+      <w:lvlText w:val=""/>
+      <w:lvlJc w:val="left"/>
+      <w:pPr>
+        <w:tabs>
+          <w:tab w:val="num" w:pos="5040"/>
+        </w:tabs>
+        <w:ind w:left="5040" w:hanging="360"/>
+      </w:pPr>
+      <w:rPr>
+        <w:rFonts w:ascii="Symbol" w:hAnsi="Symbol" w:hint="default"/>
+        <w:sz w:val="20"/>
+      </w:rPr>
+    </w:lvl>
+    <w:lvl w:ilvl="7" w:tentative="1">
+      <w:start w:val="1"/>
+      <w:numFmt w:val="bullet"/>
+      <w:lvlText w:val=""/>
+      <w:lvlJc w:val="left"/>
+      <w:pPr>
+        <w:tabs>
+          <w:tab w:val="num" w:pos="5760"/>
+        </w:tabs>
+        <w:ind w:left="5760" w:hanging="360"/>
+      </w:pPr>
+      <w:rPr>
+        <w:rFonts w:ascii="Symbol" w:hAnsi="Symbol" w:hint="default"/>
+        <w:sz w:val="20"/>
+      </w:rPr>
+    </w:lvl>
+    <w:lvl w:ilvl="8" w:tentative="1">
+      <w:start w:val="1"/>
+      <w:numFmt w:val="bullet"/>
+      <w:lvlText w:val=""/>
+      <w:lvlJc w:val="left"/>
+      <w:pPr>
+        <w:tabs>
+          <w:tab w:val="num" w:pos="6480"/>
+        </w:tabs>
+        <w:ind w:left="6480" w:hanging="360"/>
+      </w:pPr>
+      <w:rPr>
+        <w:rFonts w:ascii="Symbol" w:hAnsi="Symbol" w:hint="default"/>
+        <w:sz w:val="20"/>
+      </w:rPr>
+    </w:lvl>
+  </w:abstractNum>
+  <w:abstractNum w:abstractNumId="3" w15:restartNumberingAfterBreak="0">
+    <w:nsid w:val="2B6E6300"/>
+    <w:multiLevelType w:val="multilevel"/>
+    <w:tmpl w:val="AC0E3F84"/>
+    <w:lvl w:ilvl="0">
+      <w:start w:val="1"/>
+      <w:numFmt w:val="bullet"/>
+      <w:lvlText w:val=""/>
+      <w:lvlJc w:val="left"/>
+      <w:pPr>
+        <w:tabs>
+          <w:tab w:val="num" w:pos="720"/>
+        </w:tabs>
+        <w:ind w:left="720" w:hanging="360"/>
+      </w:pPr>
+      <w:rPr>
+        <w:rFonts w:ascii="Symbol" w:hAnsi="Symbol" w:hint="default"/>
+        <w:sz w:val="20"/>
+      </w:rPr>
+    </w:lvl>
+    <w:lvl w:ilvl="1">
+      <w:start w:val="1"/>
+      <w:numFmt w:val="bullet"/>
+      <w:lvlText w:val=""/>
+      <w:lvlJc w:val="left"/>
+      <w:pPr>
+        <w:tabs>
+          <w:tab w:val="num" w:pos="1440"/>
+        </w:tabs>
+        <w:ind w:left="1440" w:hanging="360"/>
+      </w:pPr>
+      <w:rPr>
+        <w:rFonts w:ascii="Symbol" w:hAnsi="Symbol" w:hint="default"/>
+        <w:sz w:val="20"/>
+      </w:rPr>
+    </w:lvl>
+    <w:lvl w:ilvl="2" w:tentative="1">
+      <w:start w:val="1"/>
+      <w:numFmt w:val="bullet"/>
+      <w:lvlText w:val=""/>
+      <w:lvlJc w:val="left"/>
+      <w:pPr>
+        <w:tabs>
+          <w:tab w:val="num" w:pos="2160"/>
+        </w:tabs>
+        <w:ind w:left="2160" w:hanging="360"/>
+      </w:pPr>
+      <w:rPr>
+        <w:rFonts w:ascii="Symbol" w:hAnsi="Symbol" w:hint="default"/>
+        <w:sz w:val="20"/>
+      </w:rPr>
+    </w:lvl>
+    <w:lvl w:ilvl="3" w:tentative="1">
+      <w:start w:val="1"/>
+      <w:numFmt w:val="bullet"/>
+      <w:lvlText w:val=""/>
+      <w:lvlJc w:val="left"/>
+      <w:pPr>
+        <w:tabs>
+          <w:tab w:val="num" w:pos="2880"/>
+        </w:tabs>
+        <w:ind w:left="2880" w:hanging="360"/>
+      </w:pPr>
+      <w:rPr>
+        <w:rFonts w:ascii="Symbol" w:hAnsi="Symbol" w:hint="default"/>
+        <w:sz w:val="20"/>
+      </w:rPr>
+    </w:lvl>
+    <w:lvl w:ilvl="4" w:tentative="1">
+      <w:start w:val="1"/>
+      <w:numFmt w:val="bullet"/>
+      <w:lvlText w:val=""/>
+      <w:lvlJc w:val="left"/>
+      <w:pPr>
+        <w:tabs>
+          <w:tab w:val="num" w:pos="3600"/>
+        </w:tabs>
+        <w:ind w:left="3600" w:hanging="360"/>
+      </w:pPr>
+      <w:rPr>
+        <w:rFonts w:ascii="Symbol" w:hAnsi="Symbol" w:hint="default"/>
+        <w:sz w:val="20"/>
+      </w:rPr>
+    </w:lvl>
+    <w:lvl w:ilvl="5" w:tentative="1">
+      <w:start w:val="1"/>
+      <w:numFmt w:val="bullet"/>
+      <w:lvlText w:val=""/>
+      <w:lvlJc w:val="left"/>
+      <w:pPr>
+        <w:tabs>
+          <w:tab w:val="num" w:pos="4320"/>
+        </w:tabs>
+        <w:ind w:left="4320" w:hanging="360"/>
+      </w:pPr>
+      <w:rPr>
+        <w:rFonts w:ascii="Symbol" w:hAnsi="Symbol" w:hint="default"/>
+        <w:sz w:val="20"/>
+      </w:rPr>
+    </w:lvl>
+    <w:lvl w:ilvl="6" w:tentative="1">
+      <w:start w:val="1"/>
+      <w:numFmt w:val="bullet"/>
+      <w:lvlText w:val=""/>
+      <w:lvlJc w:val="left"/>
+      <w:pPr>
+        <w:tabs>
+          <w:tab w:val="num" w:pos="5040"/>
+        </w:tabs>
+        <w:ind w:left="5040" w:hanging="360"/>
+      </w:pPr>
+      <w:rPr>
+        <w:rFonts w:ascii="Symbol" w:hAnsi="Symbol" w:hint="default"/>
+        <w:sz w:val="20"/>
+      </w:rPr>
+    </w:lvl>
+    <w:lvl w:ilvl="7" w:tentative="1">
+      <w:start w:val="1"/>
+      <w:numFmt w:val="bullet"/>
+      <w:lvlText w:val=""/>
+      <w:lvlJc w:val="left"/>
+      <w:pPr>
+        <w:tabs>
+          <w:tab w:val="num" w:pos="5760"/>
+        </w:tabs>
+        <w:ind w:left="5760" w:hanging="360"/>
+      </w:pPr>
+      <w:rPr>
+        <w:rFonts w:ascii="Symbol" w:hAnsi="Symbol" w:hint="default"/>
+        <w:sz w:val="20"/>
+      </w:rPr>
+    </w:lvl>
+    <w:lvl w:ilvl="8" w:tentative="1">
+      <w:start w:val="1"/>
+      <w:numFmt w:val="bullet"/>
+      <w:lvlText w:val=""/>
+      <w:lvlJc w:val="left"/>
+      <w:pPr>
+        <w:tabs>
+          <w:tab w:val="num" w:pos="6480"/>
+        </w:tabs>
+        <w:ind w:left="6480" w:hanging="360"/>
+      </w:pPr>
+      <w:rPr>
+        <w:rFonts w:ascii="Symbol" w:hAnsi="Symbol" w:hint="default"/>
+        <w:sz w:val="20"/>
+      </w:rPr>
+    </w:lvl>
+  </w:abstractNum>
+  <w:abstractNum w:abstractNumId="4" w15:restartNumberingAfterBreak="0">
+    <w:nsid w:val="2F796B40"/>
+    <w:multiLevelType w:val="multilevel"/>
+    <w:tmpl w:val="8D7C59D8"/>
+    <w:lvl w:ilvl="0">
+      <w:start w:val="1"/>
+      <w:numFmt w:val="bullet"/>
+      <w:lvlText w:val=""/>
+      <w:lvlJc w:val="left"/>
+      <w:pPr>
+        <w:tabs>
+          <w:tab w:val="num" w:pos="720"/>
+        </w:tabs>
+        <w:ind w:left="720" w:hanging="360"/>
+      </w:pPr>
+      <w:rPr>
+        <w:rFonts w:ascii="Symbol" w:hAnsi="Symbol" w:hint="default"/>
+        <w:sz w:val="20"/>
+      </w:rPr>
+    </w:lvl>
+    <w:lvl w:ilvl="1">
+      <w:start w:val="1"/>
+      <w:numFmt w:val="bullet"/>
+      <w:lvlText w:val=""/>
+      <w:lvlJc w:val="left"/>
+      <w:pPr>
+        <w:tabs>
+          <w:tab w:val="num" w:pos="1440"/>
+        </w:tabs>
+        <w:ind w:left="1440" w:hanging="360"/>
+      </w:pPr>
+      <w:rPr>
+        <w:rFonts w:ascii="Symbol" w:hAnsi="Symbol" w:hint="default"/>
+        <w:sz w:val="20"/>
+      </w:rPr>
+    </w:lvl>
+    <w:lvl w:ilvl="2" w:tentative="1">
+      <w:start w:val="1"/>
+      <w:numFmt w:val="bullet"/>
+      <w:lvlText w:val=""/>
+      <w:lvlJc w:val="left"/>
+      <w:pPr>
+        <w:tabs>
+          <w:tab w:val="num" w:pos="2160"/>
+        </w:tabs>
+        <w:ind w:left="2160" w:hanging="360"/>
+      </w:pPr>
+      <w:rPr>
+        <w:rFonts w:ascii="Symbol" w:hAnsi="Symbol" w:hint="default"/>
+        <w:sz w:val="20"/>
+      </w:rPr>
+    </w:lvl>
+    <w:lvl w:ilvl="3" w:tentative="1">
+      <w:start w:val="1"/>
+      <w:numFmt w:val="bullet"/>
+      <w:lvlText w:val=""/>
+      <w:lvlJc w:val="left"/>
+      <w:pPr>
+        <w:tabs>
+          <w:tab w:val="num" w:pos="2880"/>
+        </w:tabs>
+        <w:ind w:left="2880" w:hanging="360"/>
+      </w:pPr>
+      <w:rPr>
+        <w:rFonts w:ascii="Symbol" w:hAnsi="Symbol" w:hint="default"/>
+        <w:sz w:val="20"/>
+      </w:rPr>
+    </w:lvl>
+    <w:lvl w:ilvl="4" w:tentative="1">
+      <w:start w:val="1"/>
+      <w:numFmt w:val="bullet"/>
+      <w:lvlText w:val=""/>
+      <w:lvlJc w:val="left"/>
+      <w:pPr>
+        <w:tabs>
+          <w:tab w:val="num" w:pos="3600"/>
+        </w:tabs>
+        <w:ind w:left="3600" w:hanging="360"/>
+      </w:pPr>
+      <w:rPr>
+        <w:rFonts w:ascii="Symbol" w:hAnsi="Symbol" w:hint="default"/>
+        <w:sz w:val="20"/>
+      </w:rPr>
+    </w:lvl>
+    <w:lvl w:ilvl="5" w:tentative="1">
+      <w:start w:val="1"/>
+      <w:numFmt w:val="bullet"/>
+      <w:lvlText w:val=""/>
+      <w:lvlJc w:val="left"/>
+      <w:pPr>
+        <w:tabs>
+          <w:tab w:val="num" w:pos="4320"/>
+        </w:tabs>
+        <w:ind w:left="4320" w:hanging="360"/>
+      </w:pPr>
+      <w:rPr>
+        <w:rFonts w:ascii="Symbol" w:hAnsi="Symbol" w:hint="default"/>
+        <w:sz w:val="20"/>
+      </w:rPr>
+    </w:lvl>
+    <w:lvl w:ilvl="6" w:tentative="1">
+      <w:start w:val="1"/>
+      <w:numFmt w:val="bullet"/>
+      <w:lvlText w:val=""/>
+      <w:lvlJc w:val="left"/>
+      <w:pPr>
+        <w:tabs>
+          <w:tab w:val="num" w:pos="5040"/>
+        </w:tabs>
+        <w:ind w:left="5040" w:hanging="360"/>
+      </w:pPr>
+      <w:rPr>
+        <w:rFonts w:ascii="Symbol" w:hAnsi="Symbol" w:hint="default"/>
+        <w:sz w:val="20"/>
+      </w:rPr>
+    </w:lvl>
+    <w:lvl w:ilvl="7" w:tentative="1">
+      <w:start w:val="1"/>
+      <w:numFmt w:val="bullet"/>
+      <w:lvlText w:val=""/>
+      <w:lvlJc w:val="left"/>
+      <w:pPr>
+        <w:tabs>
+          <w:tab w:val="num" w:pos="5760"/>
+        </w:tabs>
+        <w:ind w:left="5760" w:hanging="360"/>
+      </w:pPr>
+      <w:rPr>
+        <w:rFonts w:ascii="Symbol" w:hAnsi="Symbol" w:hint="default"/>
+        <w:sz w:val="20"/>
+      </w:rPr>
+    </w:lvl>
+    <w:lvl w:ilvl="8" w:tentative="1">
+      <w:start w:val="1"/>
+      <w:numFmt w:val="bullet"/>
+      <w:lvlText w:val=""/>
+      <w:lvlJc w:val="left"/>
+      <w:pPr>
+        <w:tabs>
+          <w:tab w:val="num" w:pos="6480"/>
+        </w:tabs>
+        <w:ind w:left="6480" w:hanging="360"/>
+      </w:pPr>
+      <w:rPr>
+        <w:rFonts w:ascii="Symbol" w:hAnsi="Symbol" w:hint="default"/>
+        <w:sz w:val="20"/>
+      </w:rPr>
+    </w:lvl>
+  </w:abstractNum>
+  <w:abstractNum w:abstractNumId="5" w15:restartNumberingAfterBreak="0">
+    <w:nsid w:val="4B39167B"/>
+    <w:multiLevelType w:val="multilevel"/>
+    <w:tmpl w:val="3656CDE6"/>
+    <w:lvl w:ilvl="0">
+      <w:start w:val="1"/>
+      <w:numFmt w:val="bullet"/>
+      <w:lvlText w:val=""/>
+      <w:lvlJc w:val="left"/>
+      <w:pPr>
+        <w:tabs>
+          <w:tab w:val="num" w:pos="720"/>
+        </w:tabs>
+        <w:ind w:left="720" w:hanging="360"/>
+      </w:pPr>
+      <w:rPr>
+        <w:rFonts w:ascii="Symbol" w:hAnsi="Symbol" w:hint="default"/>
+        <w:sz w:val="20"/>
+      </w:rPr>
+    </w:lvl>
+    <w:lvl w:ilvl="1">
+      <w:start w:val="1"/>
+      <w:numFmt w:val="bullet"/>
+      <w:lvlText w:val=""/>
+      <w:lvlJc w:val="left"/>
+      <w:pPr>
+        <w:tabs>
+          <w:tab w:val="num" w:pos="1440"/>
+        </w:tabs>
+        <w:ind w:left="1440" w:hanging="360"/>
+      </w:pPr>
+      <w:rPr>
+        <w:rFonts w:ascii="Symbol" w:hAnsi="Symbol" w:hint="default"/>
+        <w:sz w:val="20"/>
+      </w:rPr>
+    </w:lvl>
+    <w:lvl w:ilvl="2" w:tentative="1">
+      <w:start w:val="1"/>
+      <w:numFmt w:val="bullet"/>
+      <w:lvlText w:val=""/>
+      <w:lvlJc w:val="left"/>
+      <w:pPr>
+        <w:tabs>
+          <w:tab w:val="num" w:pos="2160"/>
+        </w:tabs>
+        <w:ind w:left="2160" w:hanging="360"/>
+      </w:pPr>
+      <w:rPr>
+        <w:rFonts w:ascii="Symbol" w:hAnsi="Symbol" w:hint="default"/>
+        <w:sz w:val="20"/>
+      </w:rPr>
+    </w:lvl>
+    <w:lvl w:ilvl="3" w:tentative="1">
+      <w:start w:val="1"/>
+      <w:numFmt w:val="bullet"/>
+      <w:lvlText w:val=""/>
+      <w:lvlJc w:val="left"/>
+      <w:pPr>
+        <w:tabs>
+          <w:tab w:val="num" w:pos="2880"/>
+        </w:tabs>
+        <w:ind w:left="2880" w:hanging="360"/>
+      </w:pPr>
+      <w:rPr>
+        <w:rFonts w:ascii="Symbol" w:hAnsi="Symbol" w:hint="default"/>
+        <w:sz w:val="20"/>
+      </w:rPr>
+    </w:lvl>
+    <w:lvl w:ilvl="4" w:tentative="1">
+      <w:start w:val="1"/>
+      <w:numFmt w:val="bullet"/>
+      <w:lvlText w:val=""/>
+      <w:lvlJc w:val="left"/>
+      <w:pPr>
+        <w:tabs>
+          <w:tab w:val="num" w:pos="3600"/>
+        </w:tabs>
+        <w:ind w:left="3600" w:hanging="360"/>
+      </w:pPr>
+      <w:rPr>
+        <w:rFonts w:ascii="Symbol" w:hAnsi="Symbol" w:hint="default"/>
+        <w:sz w:val="20"/>
+      </w:rPr>
+    </w:lvl>
+    <w:lvl w:ilvl="5" w:tentative="1">
+      <w:start w:val="1"/>
+      <w:numFmt w:val="bullet"/>
+      <w:lvlText w:val=""/>
+      <w:lvlJc w:val="left"/>
+      <w:pPr>
+        <w:tabs>
+          <w:tab w:val="num" w:pos="4320"/>
+        </w:tabs>
+        <w:ind w:left="4320" w:hanging="360"/>
+      </w:pPr>
+      <w:rPr>
+        <w:rFonts w:ascii="Symbol" w:hAnsi="Symbol" w:hint="default"/>
+        <w:sz w:val="20"/>
+      </w:rPr>
+    </w:lvl>
+    <w:lvl w:ilvl="6" w:tentative="1">
+      <w:start w:val="1"/>
+      <w:numFmt w:val="bullet"/>
+      <w:lvlText w:val=""/>
+      <w:lvlJc w:val="left"/>
+      <w:pPr>
+        <w:tabs>
+          <w:tab w:val="num" w:pos="5040"/>
+        </w:tabs>
+        <w:ind w:left="5040" w:hanging="360"/>
+      </w:pPr>
+      <w:rPr>
+        <w:rFonts w:ascii="Symbol" w:hAnsi="Symbol" w:hint="default"/>
+        <w:sz w:val="20"/>
+      </w:rPr>
+    </w:lvl>
+    <w:lvl w:ilvl="7" w:tentative="1">
+      <w:start w:val="1"/>
+      <w:numFmt w:val="bullet"/>
+      <w:lvlText w:val=""/>
+      <w:lvlJc w:val="left"/>
+      <w:pPr>
+        <w:tabs>
+          <w:tab w:val="num" w:pos="5760"/>
+        </w:tabs>
+        <w:ind w:left="5760" w:hanging="360"/>
+      </w:pPr>
+      <w:rPr>
+        <w:rFonts w:ascii="Symbol" w:hAnsi="Symbol" w:hint="default"/>
+        <w:sz w:val="20"/>
+      </w:rPr>
+    </w:lvl>
+    <w:lvl w:ilvl="8" w:tentative="1">
+      <w:start w:val="1"/>
+      <w:numFmt w:val="bullet"/>
+      <w:lvlText w:val=""/>
+      <w:lvlJc w:val="left"/>
+      <w:pPr>
+        <w:tabs>
+          <w:tab w:val="num" w:pos="6480"/>
+        </w:tabs>
+        <w:ind w:left="6480" w:hanging="360"/>
+      </w:pPr>
+      <w:rPr>
+        <w:rFonts w:ascii="Symbol" w:hAnsi="Symbol" w:hint="default"/>
+        <w:sz w:val="20"/>
+      </w:rPr>
+    </w:lvl>
+  </w:abstractNum>
+  <w:abstractNum w:abstractNumId="6" w15:restartNumberingAfterBreak="0">
+    <w:nsid w:val="56954A5B"/>
+    <w:multiLevelType w:val="multilevel"/>
+    <w:tmpl w:val="6D3031CE"/>
+    <w:lvl w:ilvl="0">
+      <w:start w:val="1"/>
+      <w:numFmt w:val="decimal"/>
+      <w:lvlText w:val="%1."/>
+      <w:lvlJc w:val="left"/>
+      <w:pPr>
+        <w:tabs>
+          <w:tab w:val="num" w:pos="720"/>
+        </w:tabs>
+        <w:ind w:left="720" w:hanging="360"/>
+      </w:pPr>
+    </w:lvl>
+    <w:lvl w:ilvl="1">
+      <w:start w:val="1"/>
+      <w:numFmt w:val="bullet"/>
+      <w:lvlText w:val=""/>
+      <w:lvlJc w:val="left"/>
+      <w:pPr>
+        <w:tabs>
+          <w:tab w:val="num" w:pos="1440"/>
+        </w:tabs>
+        <w:ind w:left="1440" w:hanging="360"/>
+      </w:pPr>
+      <w:rPr>
+        <w:rFonts w:ascii="Symbol" w:hAnsi="Symbol" w:hint="default"/>
+        <w:sz w:val="20"/>
+      </w:rPr>
+    </w:lvl>
+    <w:lvl w:ilvl="2" w:tentative="1">
+      <w:start w:val="1"/>
+      <w:numFmt w:val="decimal"/>
+      <w:lvlText w:val="%3."/>
+      <w:lvlJc w:val="left"/>
+      <w:pPr>
+        <w:tabs>
+          <w:tab w:val="num" w:pos="2160"/>
+        </w:tabs>
+        <w:ind w:left="2160" w:hanging="360"/>
+      </w:pPr>
+    </w:lvl>
+    <w:lvl w:ilvl="3" w:tentative="1">
+      <w:start w:val="1"/>
+      <w:numFmt w:val="decimal"/>
+      <w:lvlText w:val="%4."/>
+      <w:lvlJc w:val="left"/>
+      <w:pPr>
+        <w:tabs>
+          <w:tab w:val="num" w:pos="2880"/>
+        </w:tabs>
+        <w:ind w:left="2880" w:hanging="360"/>
+      </w:pPr>
+    </w:lvl>
+    <w:lvl w:ilvl="4" w:tentative="1">
+      <w:start w:val="1"/>
+      <w:numFmt w:val="decimal"/>
+      <w:lvlText w:val="%5."/>
+      <w:lvlJc w:val="left"/>
+      <w:pPr>
+        <w:tabs>
+          <w:tab w:val="num" w:pos="3600"/>
+        </w:tabs>
+        <w:ind w:left="3600" w:hanging="360"/>
+      </w:pPr>
+    </w:lvl>
+    <w:lvl w:ilvl="5" w:tentative="1">
+      <w:start w:val="1"/>
+      <w:numFmt w:val="decimal"/>
+      <w:lvlText w:val="%6."/>
+      <w:lvlJc w:val="left"/>
+      <w:pPr>
+        <w:tabs>
+          <w:tab w:val="num" w:pos="4320"/>
+        </w:tabs>
+        <w:ind w:left="4320" w:hanging="360"/>
+      </w:pPr>
+    </w:lvl>
+    <w:lvl w:ilvl="6" w:tentative="1">
+      <w:start w:val="1"/>
+      <w:numFmt w:val="decimal"/>
+      <w:lvlText w:val="%7."/>
+      <w:lvlJc w:val="left"/>
+      <w:pPr>
+        <w:tabs>
+          <w:tab w:val="num" w:pos="5040"/>
+        </w:tabs>
+        <w:ind w:left="5040" w:hanging="360"/>
+      </w:pPr>
+    </w:lvl>
+    <w:lvl w:ilvl="7" w:tentative="1">
+      <w:start w:val="1"/>
+      <w:numFmt w:val="decimal"/>
+      <w:lvlText w:val="%8."/>
+      <w:lvlJc w:val="left"/>
+      <w:pPr>
+        <w:tabs>
+          <w:tab w:val="num" w:pos="5760"/>
+        </w:tabs>
+        <w:ind w:left="5760" w:hanging="360"/>
+      </w:pPr>
+    </w:lvl>
+    <w:lvl w:ilvl="8" w:tentative="1">
+      <w:start w:val="1"/>
+      <w:numFmt w:val="decimal"/>
+      <w:lvlText w:val="%9."/>
+      <w:lvlJc w:val="left"/>
+      <w:pPr>
+        <w:tabs>
+          <w:tab w:val="num" w:pos="6480"/>
+        </w:tabs>
+        <w:ind w:left="6480" w:hanging="360"/>
+      </w:pPr>
+    </w:lvl>
+  </w:abstractNum>
   <w:num w:numId="1" w16cid:durableId="1216166406">
+    <w:abstractNumId w:val="1"/>
+  </w:num>
+  <w:num w:numId="2" w16cid:durableId="1467510639">
+    <w:abstractNumId w:val="2"/>
+  </w:num>
+  <w:num w:numId="3" w16cid:durableId="1388456396">
+    <w:abstractNumId w:val="5"/>
+  </w:num>
+  <w:num w:numId="4" w16cid:durableId="435254246">
+    <w:abstractNumId w:val="4"/>
+  </w:num>
+  <w:num w:numId="5" w16cid:durableId="816798983">
     <w:abstractNumId w:val="0"/>
+  </w:num>
+  <w:num w:numId="6" w16cid:durableId="448624740">
+    <w:abstractNumId w:val="3"/>
+  </w:num>
+  <w:num w:numId="7" w16cid:durableId="262998146">
+    <w:abstractNumId w:val="6"/>
   </w:num>
 </w:numbering>
 </file>
 
 <file path=word/styles.xml><?xml version="1.0" encoding="utf-8"?>
-<w:styles xmlns:mc="http://schemas.openxmlformats.org/markup-compatibility/2006" xmlns:r="http://schemas.openxmlformats.org/officeDocument/2006/relationships" xmlns:w="http://schemas.openxmlformats.org/wordprocessingml/2006/main" xmlns:w14="http://schemas.microsoft.com/office/word/2010/wordml" xmlns:w15="http://schemas.microsoft.com/office/word/2012/wordml" xmlns:w16cex="http://schemas.microsoft.com/office/word/2018/wordml/cex" xmlns:w16cid="http://schemas.microsoft.com/office/word/2016/wordml/cid" xmlns:w16="http://schemas.microsoft.com/office/word/2018/wordml" xmlns:w16sdtdh="http://schemas.microsoft.com/office/word/2020/wordml/sdtdatahash" xmlns:w16se="http://schemas.microsoft.com/office/word/2015/wordml/symex" mc:Ignorable="w14 w15 w16se w16cid w16 w16cex w16sdtdh">
+<w:styles xmlns:mc="http://schemas.openxmlformats.org/markup-compatibility/2006" xmlns:r="http://schemas.openxmlformats.org/officeDocument/2006/relationships" xmlns:w="http://schemas.openxmlformats.org/wordprocessingml/2006/main" xmlns:w14="http://schemas.microsoft.com/office/word/2010/wordml" xmlns:w15="http://schemas.microsoft.com/office/word/2012/wordml" xmlns:w16cex="http://schemas.microsoft.com/office/word/2018/wordml/cex" xmlns:w16cid="http://schemas.microsoft.com/office/word/2016/wordml/cid" xmlns:w16="http://schemas.microsoft.com/office/word/2018/wordml" xmlns:w16du="http://schemas.microsoft.com/office/word/2023/wordml/word16du" xmlns:w16sdtdh="http://schemas.microsoft.com/office/word/2020/wordml/sdtdatahash" xmlns:w16se="http://schemas.microsoft.com/office/word/2015/wordml/symex" mc:Ignorable="w14 w15 w16se w16cid w16 w16cex w16sdtdh w16du">
   <w:docDefaults>
     <w:rPrDefault>
       <w:rPr>
@@ -3215,6 +5668,22 @@
       <w:szCs w:val="20"/>
     </w:rPr>
   </w:style>
+  <w:style w:type="paragraph" w:customStyle="1" w:styleId="my-2">
+    <w:name w:val="my-2"/>
+    <w:basedOn w:val="Normal"/>
+    <w:rsid w:val="00B804BD"/>
+    <w:pPr>
+      <w:spacing w:before="100" w:beforeAutospacing="1" w:after="100" w:afterAutospacing="1" w:line="240" w:lineRule="auto"/>
+    </w:pPr>
+    <w:rPr>
+      <w:rFonts w:ascii="Times New Roman" w:eastAsia="Times New Roman" w:hAnsi="Times New Roman" w:cs="Times New Roman"/>
+      <w:kern w:val="0"/>
+      <w:sz w:val="24"/>
+      <w:szCs w:val="24"/>
+      <w:lang w:eastAsia="es-MX"/>
+      <w14:ligatures w14:val="none"/>
+    </w:rPr>
+  </w:style>
 </w:styles>
 </file>
 

</xml_diff>